<commit_message>
TS 6.4 Kramam corrections Tamil, Sanskrit Jatai compare
</commit_message>
<xml_diff>
--- a/TS-Kramam/TS-6.4/TS 6.4 Tamil Krama Paatam Corrections.docx
+++ b/TS-Kramam/TS-6.4/TS 6.4 Tamil Krama Paatam Corrections.docx
@@ -51,17 +51,7 @@
           <w:szCs w:val="32"/>
           <w:u w:val="single"/>
         </w:rPr>
-        <w:t xml:space="preserve">6.4 </w:t>
-      </w:r>
-      <w:r>
-        <w:rPr>
-          <w:b/>
-          <w:bCs/>
-          <w:sz w:val="32"/>
-          <w:szCs w:val="32"/>
-          <w:u w:val="single"/>
-        </w:rPr>
-        <w:t xml:space="preserve">Tamil </w:t>
+        <w:t xml:space="preserve">6.4 Tamil </w:t>
       </w:r>
       <w:r>
         <w:rPr>
@@ -91,7 +81,18 @@
           <w:szCs w:val="32"/>
           <w:u w:val="single"/>
         </w:rPr>
-        <w:t xml:space="preserve">Observed till </w:t>
+        <w:t xml:space="preserve">Observed </w:t>
+      </w:r>
+      <w:proofErr w:type="gramStart"/>
+      <w:r>
+        <w:rPr>
+          <w:b/>
+          <w:bCs/>
+          <w:sz w:val="32"/>
+          <w:szCs w:val="32"/>
+          <w:u w:val="single"/>
+        </w:rPr>
+        <w:t xml:space="preserve">till </w:t>
       </w:r>
       <w:r>
         <w:rPr>
@@ -104,6 +105,7 @@
         </w:rPr>
         <w:t>????</w:t>
       </w:r>
+      <w:proofErr w:type="gramEnd"/>
     </w:p>
     <w:p>
       <w:pPr>
@@ -123,7 +125,7 @@
     </w:p>
     <w:tbl>
       <w:tblPr>
-        <w:tblW w:w="14006" w:type="dxa"/>
+        <w:tblW w:w="14962" w:type="dxa"/>
         <w:tblInd w:w="-792" w:type="dxa"/>
         <w:tblBorders>
           <w:top w:val="single" w:sz="4" w:space="0" w:color="000000"/>
@@ -137,8 +139,8 @@
       </w:tblPr>
       <w:tblGrid>
         <w:gridCol w:w="4048"/>
-        <w:gridCol w:w="4738"/>
-        <w:gridCol w:w="5220"/>
+        <w:gridCol w:w="5103"/>
+        <w:gridCol w:w="5811"/>
       </w:tblGrid>
       <w:tr>
         <w:tc>
@@ -150,12 +152,16 @@
               <w:spacing w:before="0" w:line="240" w:lineRule="auto"/>
               <w:jc w:val="center"/>
               <w:rPr>
+                <w:b/>
+                <w:bCs/>
                 <w:sz w:val="32"/>
                 <w:szCs w:val="32"/>
               </w:rPr>
             </w:pPr>
             <w:r>
               <w:rPr>
+                <w:b/>
+                <w:bCs/>
                 <w:sz w:val="32"/>
                 <w:szCs w:val="32"/>
               </w:rPr>
@@ -167,12 +173,16 @@
               <w:spacing w:before="0" w:line="240" w:lineRule="auto"/>
               <w:jc w:val="center"/>
               <w:rPr>
+                <w:b/>
+                <w:bCs/>
                 <w:sz w:val="32"/>
                 <w:szCs w:val="32"/>
               </w:rPr>
             </w:pPr>
             <w:r>
               <w:rPr>
+                <w:b/>
+                <w:bCs/>
                 <w:sz w:val="32"/>
                 <w:szCs w:val="32"/>
               </w:rPr>
@@ -182,19 +192,23 @@
         </w:tc>
         <w:tc>
           <w:tcPr>
-            <w:tcW w:w="4738" w:type="dxa"/>
+            <w:tcW w:w="5103" w:type="dxa"/>
           </w:tcPr>
           <w:p>
             <w:pPr>
               <w:spacing w:before="0" w:line="240" w:lineRule="auto"/>
               <w:jc w:val="center"/>
               <w:rPr>
+                <w:b/>
+                <w:bCs/>
                 <w:sz w:val="32"/>
                 <w:szCs w:val="32"/>
               </w:rPr>
             </w:pPr>
             <w:r>
               <w:rPr>
+                <w:b/>
+                <w:bCs/>
                 <w:sz w:val="32"/>
                 <w:szCs w:val="32"/>
               </w:rPr>
@@ -204,7 +218,7 @@
         </w:tc>
         <w:tc>
           <w:tcPr>
-            <w:tcW w:w="5220" w:type="dxa"/>
+            <w:tcW w:w="5811" w:type="dxa"/>
           </w:tcPr>
           <w:p>
             <w:pPr>
@@ -212,16 +226,845 @@
               <w:ind w:right="-18"/>
               <w:jc w:val="center"/>
               <w:rPr>
+                <w:b/>
+                <w:bCs/>
                 <w:sz w:val="32"/>
                 <w:szCs w:val="32"/>
               </w:rPr>
             </w:pPr>
             <w:r>
               <w:rPr>
+                <w:b/>
+                <w:bCs/>
                 <w:sz w:val="32"/>
                 <w:szCs w:val="32"/>
               </w:rPr>
               <w:t>To be read as or corrected as</w:t>
+            </w:r>
+          </w:p>
+        </w:tc>
+      </w:tr>
+      <w:tr>
+        <w:trPr>
+          <w:trHeight w:val="1814"/>
+        </w:trPr>
+        <w:tc>
+          <w:tcPr>
+            <w:tcW w:w="4048" w:type="dxa"/>
+          </w:tcPr>
+          <w:p>
+            <w:pPr>
+              <w:widowControl w:val="0"/>
+              <w:tabs>
+                <w:tab w:val="left" w:pos="993"/>
+              </w:tabs>
+              <w:autoSpaceDE w:val="0"/>
+              <w:autoSpaceDN w:val="0"/>
+              <w:adjustRightInd w:val="0"/>
+              <w:spacing w:before="0" w:line="252" w:lineRule="auto"/>
+              <w:ind w:right="297"/>
+              <w:rPr>
+                <w:rFonts w:cs="Arial"/>
+                <w:b/>
+                <w:sz w:val="28"/>
+                <w:szCs w:val="32"/>
+              </w:rPr>
+            </w:pPr>
+            <w:r>
+              <w:rPr>
+                <w:rFonts w:cs="Arial"/>
+                <w:b/>
+                <w:sz w:val="28"/>
+                <w:szCs w:val="32"/>
+              </w:rPr>
+              <w:t>T.S.6.4.</w:t>
+            </w:r>
+            <w:r>
+              <w:rPr>
+                <w:rFonts w:cs="Arial"/>
+                <w:b/>
+                <w:sz w:val="28"/>
+                <w:szCs w:val="32"/>
+              </w:rPr>
+              <w:t>3.3</w:t>
+            </w:r>
+            <w:r>
+              <w:rPr>
+                <w:rFonts w:cs="Arial"/>
+                <w:b/>
+                <w:sz w:val="28"/>
+                <w:szCs w:val="32"/>
+              </w:rPr>
+              <w:t xml:space="preserve"> – Kramam</w:t>
+            </w:r>
+          </w:p>
+          <w:p>
+            <w:pPr>
+              <w:widowControl w:val="0"/>
+              <w:tabs>
+                <w:tab w:val="left" w:pos="993"/>
+              </w:tabs>
+              <w:autoSpaceDE w:val="0"/>
+              <w:autoSpaceDN w:val="0"/>
+              <w:adjustRightInd w:val="0"/>
+              <w:spacing w:before="0" w:line="252" w:lineRule="auto"/>
+              <w:ind w:right="297"/>
+              <w:rPr>
+                <w:rFonts w:cs="Arial"/>
+                <w:b/>
+                <w:sz w:val="28"/>
+                <w:szCs w:val="32"/>
+                <w:lang w:val="en-IN"/>
+              </w:rPr>
+            </w:pPr>
+            <w:r>
+              <w:rPr>
+                <w:rFonts w:cs="Arial"/>
+                <w:b/>
+                <w:sz w:val="28"/>
+                <w:szCs w:val="32"/>
+                <w:lang w:val="en-IN"/>
+              </w:rPr>
+              <w:t>Krama Vaakyam No.–</w:t>
+            </w:r>
+            <w:r>
+              <w:rPr>
+                <w:rFonts w:cs="Arial"/>
+                <w:b/>
+                <w:sz w:val="28"/>
+                <w:szCs w:val="32"/>
+                <w:lang w:val="en-IN"/>
+              </w:rPr>
+              <w:t xml:space="preserve"> 11,38</w:t>
+            </w:r>
+          </w:p>
+          <w:p>
+            <w:pPr>
+              <w:widowControl w:val="0"/>
+              <w:autoSpaceDE w:val="0"/>
+              <w:autoSpaceDN w:val="0"/>
+              <w:adjustRightInd w:val="0"/>
+              <w:spacing w:before="0" w:line="264" w:lineRule="auto"/>
+              <w:jc w:val="both"/>
+              <w:rPr>
+                <w:rFonts w:cs="Arial"/>
+                <w:b/>
+                <w:sz w:val="28"/>
+                <w:szCs w:val="32"/>
+              </w:rPr>
+            </w:pPr>
+            <w:r>
+              <w:rPr>
+                <w:rFonts w:cs="Arial"/>
+                <w:b/>
+                <w:sz w:val="28"/>
+                <w:szCs w:val="32"/>
+                <w:lang w:val="it-IT"/>
+              </w:rPr>
+              <w:t>Panchaati No</w:t>
+            </w:r>
+            <w:r>
+              <w:rPr>
+                <w:rFonts w:cs="Arial"/>
+                <w:b/>
+                <w:szCs w:val="32"/>
+                <w:lang w:val="it-IT"/>
+              </w:rPr>
+              <w:t xml:space="preserve">. – </w:t>
+            </w:r>
+            <w:r>
+              <w:rPr>
+                <w:rFonts w:cs="Arial"/>
+                <w:b/>
+                <w:sz w:val="28"/>
+                <w:szCs w:val="28"/>
+                <w:lang w:val="it-IT"/>
+              </w:rPr>
+              <w:t>14</w:t>
+            </w:r>
+          </w:p>
+        </w:tc>
+        <w:tc>
+          <w:tcPr>
+            <w:tcW w:w="5103" w:type="dxa"/>
+          </w:tcPr>
+          <w:p>
+            <w:pPr>
+              <w:spacing w:before="0" w:line="240" w:lineRule="auto"/>
+              <w:rPr>
+                <w:rFonts w:ascii="Latha" w:hAnsi="Latha" w:cs="Latha"/>
+                <w:sz w:val="28"/>
+                <w:szCs w:val="28"/>
+                <w:lang w:bidi="ta-IN"/>
+              </w:rPr>
+            </w:pPr>
+            <w:r>
+              <w:rPr>
+                <w:rFonts w:ascii="Latha" w:hAnsi="Latha" w:cs="Latha"/>
+                <w:sz w:val="28"/>
+                <w:szCs w:val="28"/>
+                <w:cs/>
+                <w:lang w:bidi="ta-IN"/>
+              </w:rPr>
+              <w:t>அச்</w:t>
+            </w:r>
+            <w:r>
+              <w:rPr>
+                <w:rFonts w:ascii="Latha" w:hAnsi="Latha" w:cs="Latha"/>
+                <w:sz w:val="28"/>
+                <w:szCs w:val="28"/>
+                <w:highlight w:val="yellow"/>
+                <w:cs/>
+                <w:lang w:bidi="ta-IN"/>
+              </w:rPr>
+              <w:t>ச</w:t>
+            </w:r>
+            <w:r>
+              <w:rPr>
+                <w:rFonts w:ascii="Latha" w:hAnsi="Latha" w:cs="Latha"/>
+                <w:b/>
+                <w:bCs/>
+                <w:position w:val="-12"/>
+                <w:sz w:val="28"/>
+                <w:szCs w:val="28"/>
+                <w:highlight w:val="yellow"/>
+                <w:cs/>
+                <w:lang w:bidi="ta-IN"/>
+              </w:rPr>
+              <w:t>2</w:t>
+            </w:r>
+            <w:r>
+              <w:rPr>
+                <w:rFonts w:ascii="Latha" w:hAnsi="Latha" w:cs="Latha"/>
+                <w:sz w:val="28"/>
+                <w:szCs w:val="28"/>
+                <w:highlight w:val="yellow"/>
+                <w:cs/>
+                <w:lang w:bidi="ta-IN"/>
+              </w:rPr>
+              <w:t>இ</w:t>
+            </w:r>
+            <w:r>
+              <w:rPr>
+                <w:rFonts w:ascii="BRH Tamil Tab Extra" w:hAnsi="BRH Tamil Tab Extra" w:cs="Latha"/>
+                <w:b/>
+                <w:sz w:val="36"/>
+                <w:szCs w:val="28"/>
+                <w:highlight w:val="yellow"/>
+                <w:lang w:bidi="ta-IN"/>
+              </w:rPr>
+              <w:t>†</w:t>
+            </w:r>
+            <w:r>
+              <w:rPr>
+                <w:rFonts w:ascii="Latha" w:hAnsi="Latha" w:cs="Latha"/>
+                <w:sz w:val="28"/>
+                <w:szCs w:val="28"/>
+                <w:cs/>
+                <w:lang w:bidi="ta-IN"/>
+              </w:rPr>
+              <w:t>தி</w:t>
+            </w:r>
+            <w:r>
+              <w:rPr>
+                <w:rFonts w:ascii="Latha" w:hAnsi="Latha" w:cs="Latha"/>
+                <w:sz w:val="28"/>
+                <w:szCs w:val="28"/>
+                <w:lang w:bidi="ta-IN"/>
+              </w:rPr>
+              <w:t xml:space="preserve"> | </w:t>
+            </w:r>
+            <w:r>
+              <w:rPr>
+                <w:rFonts w:ascii="Latha" w:hAnsi="Latha" w:cs="Latha"/>
+                <w:sz w:val="28"/>
+                <w:szCs w:val="28"/>
+                <w:cs/>
+                <w:lang w:bidi="ta-IN"/>
+              </w:rPr>
+              <w:t>ஏ</w:t>
+            </w:r>
+            <w:r>
+              <w:rPr>
+                <w:rFonts w:ascii="BRH Tamil Tab Extra" w:hAnsi="BRH Tamil Tab Extra" w:cs="Latha"/>
+                <w:b/>
+                <w:sz w:val="32"/>
+                <w:szCs w:val="28"/>
+                <w:lang w:bidi="ta-IN"/>
+              </w:rPr>
+              <w:t>…</w:t>
+            </w:r>
+            <w:r>
+              <w:rPr>
+                <w:rFonts w:ascii="Latha" w:hAnsi="Latha" w:cs="Latha"/>
+                <w:sz w:val="28"/>
+                <w:szCs w:val="28"/>
+                <w:cs/>
+                <w:lang w:bidi="ta-IN"/>
+              </w:rPr>
+              <w:t>த்ய</w:t>
+            </w:r>
+            <w:r>
+              <w:rPr>
+                <w:rFonts w:ascii="BRH Tamil Tab Extra" w:hAnsi="BRH Tamil Tab Extra" w:cs="Latha"/>
+                <w:b/>
+                <w:sz w:val="32"/>
+                <w:szCs w:val="28"/>
+                <w:lang w:bidi="ta-IN"/>
+              </w:rPr>
+              <w:t>…</w:t>
+            </w:r>
+            <w:r>
+              <w:rPr>
+                <w:rFonts w:ascii="Latha" w:hAnsi="Latha" w:cs="Latha"/>
+                <w:sz w:val="28"/>
+                <w:szCs w:val="28"/>
+                <w:cs/>
+                <w:lang w:bidi="ta-IN"/>
+              </w:rPr>
+              <w:t>ப</w:t>
+            </w:r>
+            <w:r>
+              <w:rPr>
+                <w:rFonts w:ascii="Latha" w:hAnsi="Latha" w:cs="Latha"/>
+                <w:b/>
+                <w:bCs/>
+                <w:sz w:val="32"/>
+                <w:szCs w:val="32"/>
+                <w:cs/>
+                <w:lang w:bidi="ta-IN"/>
+              </w:rPr>
+              <w:t>:</w:t>
+            </w:r>
+            <w:r>
+              <w:rPr>
+                <w:rFonts w:ascii="Latha" w:hAnsi="Latha" w:cs="Latha"/>
+                <w:sz w:val="28"/>
+                <w:szCs w:val="28"/>
+                <w:lang w:bidi="ta-IN"/>
+              </w:rPr>
+              <w:t xml:space="preserve"> |</w:t>
+            </w:r>
+          </w:p>
+          <w:p>
+            <w:pPr>
+              <w:spacing w:before="0" w:line="240" w:lineRule="auto"/>
+              <w:rPr>
+                <w:rFonts w:ascii="Latha" w:hAnsi="Latha" w:cs="Latha"/>
+                <w:sz w:val="28"/>
+                <w:szCs w:val="28"/>
+                <w:cs/>
+                <w:lang w:bidi="ta-IN"/>
+              </w:rPr>
+            </w:pPr>
+            <w:r>
+              <w:rPr>
+                <w:rFonts w:ascii="Latha" w:hAnsi="Latha" w:cs="Latha"/>
+                <w:sz w:val="28"/>
+                <w:szCs w:val="28"/>
+                <w:cs/>
+                <w:lang w:bidi="ta-IN"/>
+              </w:rPr>
+              <w:t>ஏ</w:t>
+            </w:r>
+            <w:r>
+              <w:rPr>
+                <w:rFonts w:ascii="BRH Tamil Tab Extra" w:hAnsi="BRH Tamil Tab Extra" w:cs="Latha"/>
+                <w:b/>
+                <w:sz w:val="32"/>
+                <w:szCs w:val="28"/>
+                <w:lang w:bidi="ta-IN"/>
+              </w:rPr>
+              <w:t>…</w:t>
+            </w:r>
+            <w:r>
+              <w:rPr>
+                <w:rFonts w:ascii="Latha" w:hAnsi="Latha" w:cs="Latha"/>
+                <w:sz w:val="28"/>
+                <w:szCs w:val="28"/>
+                <w:cs/>
+                <w:lang w:bidi="ta-IN"/>
+              </w:rPr>
+              <w:t>னா</w:t>
+            </w:r>
+            <w:r>
+              <w:rPr>
+                <w:rFonts w:ascii="BRH Tamil Tab Extra" w:hAnsi="BRH Tamil Tab Extra" w:cs="Latha"/>
+                <w:b/>
+                <w:sz w:val="32"/>
+                <w:szCs w:val="28"/>
+                <w:lang w:bidi="ta-IN"/>
+              </w:rPr>
+              <w:t>…</w:t>
+            </w:r>
+            <w:r>
+              <w:rPr>
+                <w:rFonts w:ascii="Latha" w:hAnsi="Latha" w:cs="Latha"/>
+                <w:sz w:val="28"/>
+                <w:szCs w:val="28"/>
+                <w:lang w:bidi="ta-IN"/>
+              </w:rPr>
+              <w:t xml:space="preserve"> </w:t>
+            </w:r>
+            <w:r>
+              <w:rPr>
+                <w:rFonts w:ascii="Latha" w:hAnsi="Latha" w:cs="Latha"/>
+                <w:sz w:val="28"/>
+                <w:szCs w:val="28"/>
+                <w:cs/>
+                <w:lang w:bidi="ta-IN"/>
+              </w:rPr>
+              <w:t>அச்ச</w:t>
+            </w:r>
+            <w:r>
+              <w:rPr>
+                <w:rFonts w:ascii="BRH Tamil Tab Extra" w:hAnsi="BRH Tamil Tab Extra" w:cs="Latha"/>
+                <w:b/>
+                <w:sz w:val="36"/>
+                <w:szCs w:val="28"/>
+                <w:lang w:bidi="ta-IN"/>
+              </w:rPr>
+              <w:t>†</w:t>
+            </w:r>
+            <w:r>
+              <w:rPr>
+                <w:rFonts w:ascii="Latha" w:hAnsi="Latha" w:cs="Latha"/>
+                <w:b/>
+                <w:bCs/>
+                <w:position w:val="-12"/>
+                <w:sz w:val="28"/>
+                <w:szCs w:val="28"/>
+                <w:cs/>
+                <w:lang w:bidi="ta-IN"/>
+              </w:rPr>
+              <w:t>2</w:t>
+            </w:r>
+            <w:r>
+              <w:rPr>
+                <w:rFonts w:ascii="Latha" w:hAnsi="Latha" w:cs="Latha"/>
+                <w:sz w:val="28"/>
+                <w:szCs w:val="28"/>
+                <w:lang w:bidi="ta-IN"/>
+              </w:rPr>
+              <w:t xml:space="preserve"> | </w:t>
+            </w:r>
+            <w:r>
+              <w:rPr>
+                <w:rFonts w:ascii="Latha" w:hAnsi="Latha" w:cs="Latha"/>
+                <w:sz w:val="28"/>
+                <w:szCs w:val="28"/>
+                <w:cs/>
+                <w:lang w:bidi="ta-IN"/>
+              </w:rPr>
+              <w:t>அ</w:t>
+            </w:r>
+            <w:r>
+              <w:rPr>
+                <w:rFonts w:ascii="Latha" w:hAnsi="Latha" w:cs="Latha"/>
+                <w:sz w:val="28"/>
+                <w:szCs w:val="28"/>
+                <w:cs/>
+                <w:lang w:bidi="ta-IN"/>
+              </w:rPr>
+              <w:t>ச்</w:t>
+            </w:r>
+            <w:r>
+              <w:rPr>
+                <w:rFonts w:ascii="Latha" w:hAnsi="Latha" w:cs="Latha"/>
+                <w:sz w:val="28"/>
+                <w:szCs w:val="28"/>
+                <w:highlight w:val="yellow"/>
+                <w:cs/>
+                <w:lang w:bidi="ta-IN"/>
+              </w:rPr>
+              <w:t>ச</w:t>
+            </w:r>
+            <w:r>
+              <w:rPr>
+                <w:rFonts w:ascii="Latha" w:hAnsi="Latha" w:cs="Latha"/>
+                <w:b/>
+                <w:bCs/>
+                <w:position w:val="-12"/>
+                <w:sz w:val="28"/>
+                <w:szCs w:val="28"/>
+                <w:highlight w:val="yellow"/>
+                <w:cs/>
+                <w:lang w:bidi="ta-IN"/>
+              </w:rPr>
+              <w:t>2</w:t>
+            </w:r>
+            <w:r>
+              <w:rPr>
+                <w:rFonts w:ascii="Latha" w:hAnsi="Latha" w:cs="Latha"/>
+                <w:sz w:val="28"/>
+                <w:szCs w:val="28"/>
+                <w:highlight w:val="yellow"/>
+                <w:cs/>
+                <w:lang w:bidi="ta-IN"/>
+              </w:rPr>
+              <w:t>இ</w:t>
+            </w:r>
+            <w:r>
+              <w:rPr>
+                <w:rFonts w:ascii="BRH Tamil Tab Extra" w:hAnsi="BRH Tamil Tab Extra" w:cs="Latha"/>
+                <w:b/>
+                <w:sz w:val="36"/>
+                <w:szCs w:val="28"/>
+                <w:highlight w:val="yellow"/>
+                <w:lang w:bidi="ta-IN"/>
+              </w:rPr>
+              <w:t>†</w:t>
+            </w:r>
+            <w:r>
+              <w:rPr>
+                <w:rFonts w:ascii="Latha" w:hAnsi="Latha" w:cs="Latha"/>
+                <w:sz w:val="28"/>
+                <w:szCs w:val="28"/>
+                <w:cs/>
+                <w:lang w:bidi="ta-IN"/>
+              </w:rPr>
+              <w:t>தி</w:t>
+            </w:r>
+            <w:r>
+              <w:rPr>
+                <w:rFonts w:ascii="Latha" w:hAnsi="Latha" w:cs="Latha"/>
+                <w:sz w:val="28"/>
+                <w:szCs w:val="28"/>
+                <w:lang w:bidi="ta-IN"/>
+              </w:rPr>
+              <w:t xml:space="preserve"> |</w:t>
+            </w:r>
+          </w:p>
+        </w:tc>
+        <w:tc>
+          <w:tcPr>
+            <w:tcW w:w="5811" w:type="dxa"/>
+          </w:tcPr>
+          <w:p>
+            <w:pPr>
+              <w:spacing w:before="0" w:line="240" w:lineRule="auto"/>
+              <w:rPr>
+                <w:rFonts w:ascii="Latha" w:hAnsi="Latha" w:cs="Latha"/>
+                <w:sz w:val="28"/>
+                <w:szCs w:val="28"/>
+                <w:lang w:bidi="ta-IN"/>
+              </w:rPr>
+            </w:pPr>
+            <w:r>
+              <w:rPr>
+                <w:rFonts w:ascii="Latha" w:hAnsi="Latha" w:cs="Latha"/>
+                <w:sz w:val="28"/>
+                <w:szCs w:val="28"/>
+                <w:cs/>
+                <w:lang w:bidi="ta-IN"/>
+              </w:rPr>
+              <w:t>அச்</w:t>
+            </w:r>
+            <w:r>
+              <w:rPr>
+                <w:rFonts w:ascii="BRH Tamil Tab Extra" w:hAnsi="BRH Tamil Tab Extra" w:cs="Latha" w:hint="cs"/>
+                <w:b/>
+                <w:sz w:val="36"/>
+                <w:szCs w:val="28"/>
+                <w:highlight w:val="green"/>
+                <w:cs/>
+                <w:lang w:bidi="ta-IN"/>
+              </w:rPr>
+              <w:t>சை</w:t>
+            </w:r>
+            <w:r>
+              <w:rPr>
+                <w:rFonts w:ascii="BRH Tamil Tab Extra" w:hAnsi="BRH Tamil Tab Extra" w:cs="Latha"/>
+                <w:b/>
+                <w:sz w:val="36"/>
+                <w:szCs w:val="28"/>
+                <w:highlight w:val="green"/>
+                <w:lang w:bidi="ta-IN"/>
+              </w:rPr>
+              <w:t>†</w:t>
+            </w:r>
+            <w:r>
+              <w:rPr>
+                <w:rFonts w:ascii="Latha" w:hAnsi="Latha" w:cs="Latha"/>
+                <w:b/>
+                <w:bCs/>
+                <w:position w:val="-12"/>
+                <w:sz w:val="28"/>
+                <w:szCs w:val="28"/>
+                <w:highlight w:val="green"/>
+                <w:cs/>
+                <w:lang w:bidi="ta-IN"/>
+              </w:rPr>
+              <w:t>2</w:t>
+            </w:r>
+            <w:r>
+              <w:rPr>
+                <w:rFonts w:ascii="Latha" w:hAnsi="Latha" w:cs="Latha"/>
+                <w:sz w:val="28"/>
+                <w:szCs w:val="28"/>
+                <w:cs/>
+                <w:lang w:bidi="ta-IN"/>
+              </w:rPr>
+              <w:t>தி</w:t>
+            </w:r>
+            <w:r>
+              <w:rPr>
+                <w:rFonts w:ascii="Latha" w:hAnsi="Latha" w:cs="Latha"/>
+                <w:sz w:val="28"/>
+                <w:szCs w:val="28"/>
+                <w:lang w:bidi="ta-IN"/>
+              </w:rPr>
+              <w:t xml:space="preserve"> | </w:t>
+            </w:r>
+            <w:r>
+              <w:rPr>
+                <w:rFonts w:ascii="Latha" w:hAnsi="Latha" w:cs="Latha"/>
+                <w:sz w:val="28"/>
+                <w:szCs w:val="28"/>
+                <w:cs/>
+                <w:lang w:bidi="ta-IN"/>
+              </w:rPr>
+              <w:t>ஏ</w:t>
+            </w:r>
+            <w:r>
+              <w:rPr>
+                <w:rFonts w:ascii="BRH Tamil Tab Extra" w:hAnsi="BRH Tamil Tab Extra" w:cs="Latha"/>
+                <w:b/>
+                <w:sz w:val="32"/>
+                <w:szCs w:val="28"/>
+                <w:lang w:bidi="ta-IN"/>
+              </w:rPr>
+              <w:t>…</w:t>
+            </w:r>
+            <w:r>
+              <w:rPr>
+                <w:rFonts w:ascii="Latha" w:hAnsi="Latha" w:cs="Latha"/>
+                <w:sz w:val="28"/>
+                <w:szCs w:val="28"/>
+                <w:cs/>
+                <w:lang w:bidi="ta-IN"/>
+              </w:rPr>
+              <w:t>த்ய</w:t>
+            </w:r>
+            <w:r>
+              <w:rPr>
+                <w:rFonts w:ascii="BRH Tamil Tab Extra" w:hAnsi="BRH Tamil Tab Extra" w:cs="Latha"/>
+                <w:b/>
+                <w:sz w:val="32"/>
+                <w:szCs w:val="28"/>
+                <w:lang w:bidi="ta-IN"/>
+              </w:rPr>
+              <w:t>…</w:t>
+            </w:r>
+            <w:r>
+              <w:rPr>
+                <w:rFonts w:ascii="Latha" w:hAnsi="Latha" w:cs="Latha"/>
+                <w:sz w:val="28"/>
+                <w:szCs w:val="28"/>
+                <w:cs/>
+                <w:lang w:bidi="ta-IN"/>
+              </w:rPr>
+              <w:t>ப</w:t>
+            </w:r>
+            <w:r>
+              <w:rPr>
+                <w:rFonts w:ascii="Latha" w:hAnsi="Latha" w:cs="Latha"/>
+                <w:b/>
+                <w:bCs/>
+                <w:sz w:val="32"/>
+                <w:szCs w:val="32"/>
+                <w:cs/>
+                <w:lang w:bidi="ta-IN"/>
+              </w:rPr>
+              <w:t>:</w:t>
+            </w:r>
+            <w:r>
+              <w:rPr>
+                <w:rFonts w:ascii="Latha" w:hAnsi="Latha" w:cs="Latha"/>
+                <w:sz w:val="28"/>
+                <w:szCs w:val="28"/>
+                <w:lang w:bidi="ta-IN"/>
+              </w:rPr>
+              <w:t xml:space="preserve"> |</w:t>
+            </w:r>
+          </w:p>
+          <w:p>
+            <w:pPr>
+              <w:spacing w:before="0" w:line="240" w:lineRule="auto"/>
+              <w:rPr>
+                <w:rFonts w:ascii="Latha" w:hAnsi="Latha" w:cs="Latha"/>
+                <w:sz w:val="28"/>
+                <w:szCs w:val="28"/>
+                <w:cs/>
+                <w:lang w:bidi="ta-IN"/>
+              </w:rPr>
+            </w:pPr>
+            <w:r>
+              <w:rPr>
+                <w:rFonts w:ascii="Latha" w:hAnsi="Latha" w:cs="Latha"/>
+                <w:sz w:val="28"/>
+                <w:szCs w:val="28"/>
+                <w:cs/>
+                <w:lang w:bidi="ta-IN"/>
+              </w:rPr>
+              <w:t>ஏ</w:t>
+            </w:r>
+            <w:r>
+              <w:rPr>
+                <w:rFonts w:ascii="BRH Tamil Tab Extra" w:hAnsi="BRH Tamil Tab Extra" w:cs="Latha"/>
+                <w:b/>
+                <w:sz w:val="32"/>
+                <w:szCs w:val="28"/>
+                <w:lang w:bidi="ta-IN"/>
+              </w:rPr>
+              <w:t>…</w:t>
+            </w:r>
+            <w:r>
+              <w:rPr>
+                <w:rFonts w:ascii="Latha" w:hAnsi="Latha" w:cs="Latha"/>
+                <w:sz w:val="28"/>
+                <w:szCs w:val="28"/>
+                <w:cs/>
+                <w:lang w:bidi="ta-IN"/>
+              </w:rPr>
+              <w:t>னா</w:t>
+            </w:r>
+            <w:r>
+              <w:rPr>
+                <w:rFonts w:ascii="BRH Tamil Tab Extra" w:hAnsi="BRH Tamil Tab Extra" w:cs="Latha"/>
+                <w:b/>
+                <w:sz w:val="32"/>
+                <w:szCs w:val="28"/>
+                <w:lang w:bidi="ta-IN"/>
+              </w:rPr>
+              <w:t>…</w:t>
+            </w:r>
+            <w:r>
+              <w:rPr>
+                <w:rFonts w:ascii="Latha" w:hAnsi="Latha" w:cs="Latha"/>
+                <w:sz w:val="28"/>
+                <w:szCs w:val="28"/>
+                <w:lang w:bidi="ta-IN"/>
+              </w:rPr>
+              <w:t xml:space="preserve"> </w:t>
+            </w:r>
+            <w:r>
+              <w:rPr>
+                <w:rFonts w:ascii="Latha" w:hAnsi="Latha" w:cs="Latha"/>
+                <w:sz w:val="28"/>
+                <w:szCs w:val="28"/>
+                <w:cs/>
+                <w:lang w:bidi="ta-IN"/>
+              </w:rPr>
+              <w:t>அச்ச</w:t>
+            </w:r>
+            <w:r>
+              <w:rPr>
+                <w:rFonts w:ascii="BRH Tamil Tab Extra" w:hAnsi="BRH Tamil Tab Extra" w:cs="Latha"/>
+                <w:b/>
+                <w:sz w:val="36"/>
+                <w:szCs w:val="28"/>
+                <w:lang w:bidi="ta-IN"/>
+              </w:rPr>
+              <w:t>†</w:t>
+            </w:r>
+            <w:r>
+              <w:rPr>
+                <w:rFonts w:ascii="Latha" w:hAnsi="Latha" w:cs="Latha"/>
+                <w:b/>
+                <w:bCs/>
+                <w:position w:val="-12"/>
+                <w:sz w:val="28"/>
+                <w:szCs w:val="28"/>
+                <w:cs/>
+                <w:lang w:bidi="ta-IN"/>
+              </w:rPr>
+              <w:t>2</w:t>
+            </w:r>
+            <w:r>
+              <w:rPr>
+                <w:rFonts w:ascii="Latha" w:hAnsi="Latha" w:cs="Latha"/>
+                <w:sz w:val="28"/>
+                <w:szCs w:val="28"/>
+                <w:lang w:bidi="ta-IN"/>
+              </w:rPr>
+              <w:t xml:space="preserve"> | </w:t>
+            </w:r>
+            <w:r>
+              <w:rPr>
+                <w:rFonts w:ascii="Latha" w:hAnsi="Latha" w:cs="Latha"/>
+                <w:sz w:val="28"/>
+                <w:szCs w:val="28"/>
+                <w:cs/>
+                <w:lang w:bidi="ta-IN"/>
+              </w:rPr>
+              <w:t>அ</w:t>
+            </w:r>
+            <w:r>
+              <w:rPr>
+                <w:rFonts w:ascii="Latha" w:hAnsi="Latha" w:cs="Latha"/>
+                <w:sz w:val="28"/>
+                <w:szCs w:val="28"/>
+                <w:cs/>
+                <w:lang w:bidi="ta-IN"/>
+              </w:rPr>
+              <w:t>ச்</w:t>
+            </w:r>
+            <w:r>
+              <w:rPr>
+                <w:rFonts w:ascii="BRH Tamil Tab Extra" w:hAnsi="BRH Tamil Tab Extra" w:cs="Latha" w:hint="cs"/>
+                <w:b/>
+                <w:sz w:val="36"/>
+                <w:szCs w:val="28"/>
+                <w:highlight w:val="green"/>
+                <w:cs/>
+                <w:lang w:bidi="ta-IN"/>
+              </w:rPr>
+              <w:t>சை</w:t>
+            </w:r>
+            <w:r>
+              <w:rPr>
+                <w:rFonts w:ascii="BRH Tamil Tab Extra" w:hAnsi="BRH Tamil Tab Extra" w:cs="Latha"/>
+                <w:b/>
+                <w:sz w:val="36"/>
+                <w:szCs w:val="28"/>
+                <w:highlight w:val="green"/>
+                <w:lang w:bidi="ta-IN"/>
+              </w:rPr>
+              <w:t>†</w:t>
+            </w:r>
+            <w:r>
+              <w:rPr>
+                <w:rFonts w:ascii="Latha" w:hAnsi="Latha" w:cs="Latha"/>
+                <w:b/>
+                <w:bCs/>
+                <w:position w:val="-12"/>
+                <w:sz w:val="28"/>
+                <w:szCs w:val="28"/>
+                <w:highlight w:val="green"/>
+                <w:cs/>
+                <w:lang w:bidi="ta-IN"/>
+              </w:rPr>
+              <w:t>2</w:t>
+            </w:r>
+            <w:r>
+              <w:rPr>
+                <w:rFonts w:ascii="Latha" w:hAnsi="Latha" w:cs="Latha"/>
+                <w:sz w:val="28"/>
+                <w:szCs w:val="28"/>
+                <w:cs/>
+                <w:lang w:bidi="ta-IN"/>
+              </w:rPr>
+              <w:t>தி</w:t>
+            </w:r>
+            <w:r>
+              <w:rPr>
+                <w:rFonts w:ascii="Latha" w:hAnsi="Latha" w:cs="Latha"/>
+                <w:sz w:val="28"/>
+                <w:szCs w:val="28"/>
+                <w:lang w:bidi="ta-IN"/>
+              </w:rPr>
+              <w:t xml:space="preserve"> |</w:t>
             </w:r>
           </w:p>
         </w:tc>
@@ -376,7 +1219,7 @@
         </w:tc>
         <w:tc>
           <w:tcPr>
-            <w:tcW w:w="4738" w:type="dxa"/>
+            <w:tcW w:w="5103" w:type="dxa"/>
           </w:tcPr>
           <w:p>
             <w:pPr>
@@ -923,21 +1766,11 @@
               </w:rPr>
               <w:t xml:space="preserve"> |</w:t>
             </w:r>
-            <w:r>
-              <w:rPr>
-                <w:rFonts w:ascii="BRH Devanagari Extra" w:hAnsi="BRH Devanagari Extra" w:cs="BRH Devanagari Extra"/>
-                <w:color w:val="000000"/>
-                <w:sz w:val="40"/>
-                <w:szCs w:val="40"/>
-                <w:lang w:val="it-IT" w:bidi="ml-IN"/>
-              </w:rPr>
-              <w:t>|</w:t>
-            </w:r>
           </w:p>
         </w:tc>
         <w:tc>
           <w:tcPr>
-            <w:tcW w:w="5220" w:type="dxa"/>
+            <w:tcW w:w="5811" w:type="dxa"/>
           </w:tcPr>
           <w:p>
             <w:pPr>
@@ -1107,360 +1940,6 @@
                 <w:lang w:val="it-IT" w:bidi="ta-IN"/>
               </w:rPr>
               <w:t>…</w:t>
-            </w:r>
-            <w:r>
-              <w:rPr>
-                <w:rFonts w:ascii="Latha" w:hAnsi="Latha" w:cs="Latha"/>
-                <w:sz w:val="28"/>
-                <w:szCs w:val="28"/>
-                <w:lang w:val="it-IT" w:bidi="ta-IN"/>
-              </w:rPr>
-              <w:t xml:space="preserve"> </w:t>
-            </w:r>
-          </w:p>
-          <w:p>
-            <w:pPr>
-              <w:spacing w:before="0" w:line="240" w:lineRule="auto"/>
-              <w:rPr>
-                <w:rFonts w:ascii="Latha" w:hAnsi="Latha" w:cs="Latha"/>
-                <w:sz w:val="28"/>
-                <w:szCs w:val="28"/>
-                <w:lang w:val="it-IT" w:bidi="ta-IN"/>
-              </w:rPr>
-            </w:pPr>
-            <w:r>
-              <w:rPr>
-                <w:rFonts w:ascii="Latha" w:hAnsi="Latha" w:cs="Latha"/>
-                <w:sz w:val="28"/>
-                <w:szCs w:val="28"/>
-                <w:cs/>
-                <w:lang w:bidi="ta-IN"/>
-              </w:rPr>
-              <w:t>க்</w:t>
-            </w:r>
-            <w:r>
-              <w:rPr>
-                <w:rFonts w:ascii="Latha" w:hAnsi="Latha" w:cs="Latha"/>
-                <w:b/>
-                <w:bCs/>
-                <w:position w:val="-12"/>
-                <w:sz w:val="28"/>
-                <w:szCs w:val="28"/>
-                <w:cs/>
-                <w:lang w:bidi="ta-IN"/>
-              </w:rPr>
-              <w:t>3</w:t>
-            </w:r>
-            <w:r>
-              <w:rPr>
-                <w:rFonts w:ascii="Latha" w:hAnsi="Latha" w:cs="Latha"/>
-                <w:sz w:val="28"/>
-                <w:szCs w:val="28"/>
-                <w:cs/>
-                <w:lang w:bidi="ta-IN"/>
-              </w:rPr>
-              <w:t>ரஹா</w:t>
-            </w:r>
-            <w:r>
-              <w:rPr>
-                <w:rFonts w:ascii="BRH Tamil Tab Extra" w:hAnsi="BRH Tamil Tab Extra" w:cs="Latha"/>
-                <w:b/>
-                <w:sz w:val="36"/>
-                <w:szCs w:val="28"/>
-                <w:lang w:val="it-IT" w:bidi="ta-IN"/>
-              </w:rPr>
-              <w:t>‡</w:t>
-            </w:r>
-            <w:r>
-              <w:rPr>
-                <w:rFonts w:ascii="Latha" w:hAnsi="Latha" w:cs="Latha"/>
-                <w:b/>
-                <w:bCs/>
-                <w:sz w:val="32"/>
-                <w:szCs w:val="32"/>
-                <w:cs/>
-                <w:lang w:bidi="ta-IN"/>
-              </w:rPr>
-              <w:t>:</w:t>
-            </w:r>
-            <w:r>
-              <w:rPr>
-                <w:rFonts w:ascii="Latha" w:hAnsi="Latha" w:cs="Latha"/>
-                <w:sz w:val="28"/>
-                <w:szCs w:val="28"/>
-                <w:lang w:val="it-IT" w:bidi="ta-IN"/>
-              </w:rPr>
-              <w:t xml:space="preserve"> | </w:t>
-            </w:r>
-          </w:p>
-          <w:p>
-            <w:pPr>
-              <w:spacing w:before="0" w:line="240" w:lineRule="auto"/>
-              <w:rPr>
-                <w:rFonts w:ascii="Latha" w:hAnsi="Latha" w:cs="Latha"/>
-                <w:sz w:val="28"/>
-                <w:szCs w:val="28"/>
-                <w:lang w:val="it-IT" w:bidi="ta-IN"/>
-              </w:rPr>
-            </w:pPr>
-            <w:r>
-              <w:rPr>
-                <w:rFonts w:ascii="Latha" w:hAnsi="Latha" w:cs="Latha"/>
-                <w:sz w:val="28"/>
-                <w:szCs w:val="28"/>
-                <w:cs/>
-                <w:lang w:bidi="ta-IN"/>
-              </w:rPr>
-              <w:t>ஐ</w:t>
-            </w:r>
-            <w:r>
-              <w:rPr>
-                <w:rFonts w:ascii="BRH Tamil Tab Extra" w:hAnsi="BRH Tamil Tab Extra" w:cs="Latha"/>
-                <w:b/>
-                <w:sz w:val="32"/>
-                <w:szCs w:val="28"/>
-                <w:lang w:val="it-IT" w:bidi="ta-IN"/>
-              </w:rPr>
-              <w:t>…</w:t>
-            </w:r>
-            <w:r>
-              <w:rPr>
-                <w:rFonts w:ascii="Latha" w:hAnsi="Latha" w:cs="Latha"/>
-                <w:sz w:val="28"/>
-                <w:szCs w:val="28"/>
-                <w:cs/>
-                <w:lang w:bidi="ta-IN"/>
-              </w:rPr>
-              <w:t>ந்</w:t>
-            </w:r>
-            <w:r>
-              <w:rPr>
-                <w:rFonts w:ascii="Latha" w:hAnsi="Latha" w:cs="Latha"/>
-                <w:sz w:val="28"/>
-                <w:szCs w:val="28"/>
-                <w:highlight w:val="green"/>
-                <w:cs/>
-                <w:lang w:bidi="ta-IN"/>
-              </w:rPr>
-              <w:t>த்</w:t>
-            </w:r>
-            <w:r>
-              <w:rPr>
-                <w:rFonts w:ascii="Latha" w:hAnsi="Latha" w:cs="Latha"/>
-                <w:b/>
-                <w:bCs/>
-                <w:position w:val="-12"/>
-                <w:sz w:val="28"/>
-                <w:szCs w:val="28"/>
-                <w:highlight w:val="green"/>
-                <w:cs/>
-                <w:lang w:bidi="ta-IN"/>
-              </w:rPr>
-              <w:t>3</w:t>
-            </w:r>
-            <w:r>
-              <w:rPr>
-                <w:rFonts w:ascii="Latha" w:hAnsi="Latha" w:cs="Latha"/>
-                <w:sz w:val="28"/>
-                <w:szCs w:val="28"/>
-                <w:highlight w:val="green"/>
-                <w:cs/>
-                <w:lang w:bidi="ta-IN"/>
-              </w:rPr>
-              <w:t>ர</w:t>
-            </w:r>
-            <w:r>
-              <w:rPr>
-                <w:rFonts w:ascii="BRH Tamil Tab Extra" w:hAnsi="BRH Tamil Tab Extra" w:cs="Latha"/>
-                <w:b/>
-                <w:sz w:val="32"/>
-                <w:szCs w:val="28"/>
-                <w:lang w:val="it-IT" w:bidi="ta-IN"/>
-              </w:rPr>
-              <w:t>…</w:t>
-            </w:r>
-            <w:r>
-              <w:rPr>
-                <w:rFonts w:ascii="Latha" w:hAnsi="Latha" w:cs="Latha"/>
-                <w:sz w:val="28"/>
-                <w:szCs w:val="28"/>
-                <w:cs/>
-                <w:lang w:bidi="ta-IN"/>
-              </w:rPr>
-              <w:t>வா</w:t>
-            </w:r>
-            <w:r>
-              <w:rPr>
-                <w:rFonts w:ascii="BRH Tamil Tab Extra" w:hAnsi="BRH Tamil Tab Extra" w:cs="Latha"/>
-                <w:b/>
-                <w:sz w:val="32"/>
-                <w:szCs w:val="28"/>
-                <w:lang w:val="it-IT" w:bidi="ta-IN"/>
-              </w:rPr>
-              <w:t>…</w:t>
-            </w:r>
-            <w:r>
-              <w:rPr>
-                <w:rFonts w:ascii="Latha" w:hAnsi="Latha" w:cs="Latha"/>
-                <w:sz w:val="28"/>
-                <w:szCs w:val="28"/>
-                <w:cs/>
-                <w:lang w:bidi="ta-IN"/>
-              </w:rPr>
-              <w:t>ய</w:t>
-            </w:r>
-            <w:r>
-              <w:rPr>
-                <w:rFonts w:ascii="BRH Tamil Tab Extra" w:hAnsi="BRH Tamil Tab Extra" w:cs="Latha"/>
-                <w:b/>
-                <w:sz w:val="32"/>
-                <w:szCs w:val="28"/>
-                <w:lang w:val="it-IT" w:bidi="ta-IN"/>
-              </w:rPr>
-              <w:t>…</w:t>
-            </w:r>
-            <w:r>
-              <w:rPr>
-                <w:rFonts w:ascii="Latha" w:hAnsi="Latha" w:cs="Latha"/>
-                <w:sz w:val="28"/>
-                <w:szCs w:val="28"/>
-                <w:cs/>
-                <w:lang w:bidi="ta-IN"/>
-              </w:rPr>
-              <w:t>வாக்</w:t>
-            </w:r>
-            <w:r>
-              <w:rPr>
-                <w:rFonts w:ascii="Latha" w:hAnsi="Latha" w:cs="Latha"/>
-                <w:b/>
-                <w:bCs/>
-                <w:position w:val="-12"/>
-                <w:sz w:val="28"/>
-                <w:szCs w:val="28"/>
-                <w:cs/>
-                <w:lang w:bidi="ta-IN"/>
-              </w:rPr>
-              <w:t>3</w:t>
-            </w:r>
-            <w:r>
-              <w:rPr>
-                <w:rFonts w:ascii="Latha" w:hAnsi="Latha" w:cs="Latha"/>
-                <w:sz w:val="28"/>
-                <w:szCs w:val="28"/>
-                <w:cs/>
-                <w:lang w:bidi="ta-IN"/>
-              </w:rPr>
-              <w:t>ரா</w:t>
-            </w:r>
-            <w:r>
-              <w:rPr>
-                <w:rFonts w:ascii="BRH Tamil Tab Extra" w:hAnsi="BRH Tamil Tab Extra" w:cs="Latha"/>
-                <w:b/>
-                <w:sz w:val="32"/>
-                <w:szCs w:val="28"/>
-                <w:lang w:val="it-IT" w:bidi="ta-IN"/>
-              </w:rPr>
-              <w:t>…</w:t>
-            </w:r>
-            <w:r>
-              <w:rPr>
-                <w:rFonts w:ascii="Latha" w:hAnsi="Latha" w:cs="Latha"/>
-                <w:sz w:val="28"/>
-                <w:szCs w:val="28"/>
-                <w:lang w:val="it-IT" w:bidi="ta-IN"/>
-              </w:rPr>
-              <w:t xml:space="preserve"> </w:t>
-            </w:r>
-            <w:r>
-              <w:rPr>
-                <w:rFonts w:ascii="Latha" w:hAnsi="Latha" w:cs="Latha"/>
-                <w:sz w:val="28"/>
-                <w:szCs w:val="28"/>
-                <w:cs/>
-                <w:lang w:bidi="ta-IN"/>
-              </w:rPr>
-              <w:t>இத்யை</w:t>
-            </w:r>
-            <w:r>
-              <w:rPr>
-                <w:rFonts w:ascii="BRH Tamil Tab Extra" w:hAnsi="BRH Tamil Tab Extra" w:cs="Latha"/>
-                <w:b/>
-                <w:sz w:val="36"/>
-                <w:szCs w:val="28"/>
-                <w:lang w:val="it-IT" w:bidi="ta-IN"/>
-              </w:rPr>
-              <w:t>‡</w:t>
-            </w:r>
-            <w:r>
-              <w:rPr>
-                <w:rFonts w:ascii="Latha" w:hAnsi="Latha" w:cs="Latha"/>
-                <w:sz w:val="28"/>
-                <w:szCs w:val="28"/>
-                <w:cs/>
-                <w:lang w:bidi="ta-IN"/>
-              </w:rPr>
-              <w:t>ந்த்</w:t>
-            </w:r>
-            <w:r>
-              <w:rPr>
-                <w:rFonts w:ascii="Latha" w:hAnsi="Latha" w:cs="Latha"/>
-                <w:b/>
-                <w:bCs/>
-                <w:position w:val="-12"/>
-                <w:sz w:val="28"/>
-                <w:szCs w:val="28"/>
-                <w:cs/>
-                <w:lang w:bidi="ta-IN"/>
-              </w:rPr>
-              <w:t>3</w:t>
-            </w:r>
-            <w:r>
-              <w:rPr>
-                <w:rFonts w:ascii="Latha" w:hAnsi="Latha" w:cs="Latha"/>
-                <w:sz w:val="28"/>
-                <w:szCs w:val="28"/>
-                <w:cs/>
-                <w:lang w:bidi="ta-IN"/>
-              </w:rPr>
-              <w:t>ரவாய</w:t>
-            </w:r>
-            <w:r>
-              <w:rPr>
-                <w:rFonts w:ascii="BRH Tamil Tab Extra" w:hAnsi="BRH Tamil Tab Extra" w:cs="Latha"/>
-                <w:b/>
-                <w:sz w:val="32"/>
-                <w:szCs w:val="28"/>
-                <w:lang w:val="it-IT" w:bidi="ta-IN"/>
-              </w:rPr>
-              <w:t>…</w:t>
-            </w:r>
-            <w:r>
-              <w:rPr>
-                <w:rFonts w:ascii="Latha" w:hAnsi="Latha" w:cs="Latha"/>
-                <w:sz w:val="28"/>
-                <w:szCs w:val="28"/>
-                <w:cs/>
-                <w:lang w:bidi="ta-IN"/>
-              </w:rPr>
-              <w:t>வ</w:t>
-            </w:r>
-            <w:r>
-              <w:rPr>
-                <w:rFonts w:ascii="Latha" w:hAnsi="Latha" w:cs="Latha"/>
-                <w:sz w:val="28"/>
-                <w:szCs w:val="28"/>
-                <w:lang w:val="it-IT" w:bidi="ta-IN"/>
-              </w:rPr>
-              <w:t xml:space="preserve"> </w:t>
-            </w:r>
-            <w:r>
-              <w:rPr>
-                <w:rFonts w:ascii="Latha" w:hAnsi="Latha" w:cs="Latha"/>
-                <w:sz w:val="28"/>
-                <w:szCs w:val="28"/>
-                <w:lang w:val="it-IT" w:bidi="ta-IN"/>
-              </w:rPr>
-              <w:t>–</w:t>
             </w:r>
             <w:r>
               <w:rPr>
@@ -1491,6 +1970,338 @@
                 <w:cs/>
                 <w:lang w:bidi="ta-IN"/>
               </w:rPr>
+              <w:t>க்</w:t>
+            </w:r>
+            <w:r>
+              <w:rPr>
+                <w:rFonts w:ascii="Latha" w:hAnsi="Latha" w:cs="Latha"/>
+                <w:b/>
+                <w:bCs/>
+                <w:position w:val="-12"/>
+                <w:sz w:val="28"/>
+                <w:szCs w:val="28"/>
+                <w:cs/>
+                <w:lang w:bidi="ta-IN"/>
+              </w:rPr>
+              <w:t>3</w:t>
+            </w:r>
+            <w:r>
+              <w:rPr>
+                <w:rFonts w:ascii="Latha" w:hAnsi="Latha" w:cs="Latha"/>
+                <w:sz w:val="28"/>
+                <w:szCs w:val="28"/>
+                <w:cs/>
+                <w:lang w:bidi="ta-IN"/>
+              </w:rPr>
+              <w:t>ரஹா</w:t>
+            </w:r>
+            <w:r>
+              <w:rPr>
+                <w:rFonts w:ascii="BRH Tamil Tab Extra" w:hAnsi="BRH Tamil Tab Extra" w:cs="Latha"/>
+                <w:b/>
+                <w:sz w:val="36"/>
+                <w:szCs w:val="28"/>
+                <w:lang w:val="it-IT" w:bidi="ta-IN"/>
+              </w:rPr>
+              <w:t>‡</w:t>
+            </w:r>
+            <w:r>
+              <w:rPr>
+                <w:rFonts w:ascii="Latha" w:hAnsi="Latha" w:cs="Latha"/>
+                <w:b/>
+                <w:bCs/>
+                <w:sz w:val="32"/>
+                <w:szCs w:val="32"/>
+                <w:cs/>
+                <w:lang w:bidi="ta-IN"/>
+              </w:rPr>
+              <w:t>:</w:t>
+            </w:r>
+            <w:r>
+              <w:rPr>
+                <w:rFonts w:ascii="Latha" w:hAnsi="Latha" w:cs="Latha"/>
+                <w:sz w:val="28"/>
+                <w:szCs w:val="28"/>
+                <w:lang w:val="it-IT" w:bidi="ta-IN"/>
+              </w:rPr>
+              <w:t xml:space="preserve"> | </w:t>
+            </w:r>
+            <w:r>
+              <w:rPr>
+                <w:rFonts w:ascii="Latha" w:hAnsi="Latha" w:cs="Latha"/>
+                <w:sz w:val="28"/>
+                <w:szCs w:val="28"/>
+                <w:cs/>
+                <w:lang w:bidi="ta-IN"/>
+              </w:rPr>
+              <w:t>ஐ</w:t>
+            </w:r>
+            <w:r>
+              <w:rPr>
+                <w:rFonts w:ascii="BRH Tamil Tab Extra" w:hAnsi="BRH Tamil Tab Extra" w:cs="Latha"/>
+                <w:b/>
+                <w:sz w:val="32"/>
+                <w:szCs w:val="28"/>
+                <w:lang w:val="it-IT" w:bidi="ta-IN"/>
+              </w:rPr>
+              <w:t>…</w:t>
+            </w:r>
+            <w:r>
+              <w:rPr>
+                <w:rFonts w:ascii="Latha" w:hAnsi="Latha" w:cs="Latha"/>
+                <w:sz w:val="28"/>
+                <w:szCs w:val="28"/>
+                <w:cs/>
+                <w:lang w:bidi="ta-IN"/>
+              </w:rPr>
+              <w:t>ந்</w:t>
+            </w:r>
+            <w:r>
+              <w:rPr>
+                <w:rFonts w:ascii="Latha" w:hAnsi="Latha" w:cs="Latha"/>
+                <w:sz w:val="28"/>
+                <w:szCs w:val="28"/>
+                <w:highlight w:val="green"/>
+                <w:cs/>
+                <w:lang w:bidi="ta-IN"/>
+              </w:rPr>
+              <w:t>த்</w:t>
+            </w:r>
+            <w:r>
+              <w:rPr>
+                <w:rFonts w:ascii="Latha" w:hAnsi="Latha" w:cs="Latha"/>
+                <w:b/>
+                <w:bCs/>
+                <w:position w:val="-12"/>
+                <w:sz w:val="28"/>
+                <w:szCs w:val="28"/>
+                <w:highlight w:val="green"/>
+                <w:cs/>
+                <w:lang w:bidi="ta-IN"/>
+              </w:rPr>
+              <w:t>3</w:t>
+            </w:r>
+            <w:r>
+              <w:rPr>
+                <w:rFonts w:ascii="Latha" w:hAnsi="Latha" w:cs="Latha"/>
+                <w:sz w:val="28"/>
+                <w:szCs w:val="28"/>
+                <w:highlight w:val="green"/>
+                <w:cs/>
+                <w:lang w:bidi="ta-IN"/>
+              </w:rPr>
+              <w:t>ர</w:t>
+            </w:r>
+            <w:r>
+              <w:rPr>
+                <w:rFonts w:ascii="BRH Tamil Tab Extra" w:hAnsi="BRH Tamil Tab Extra" w:cs="Latha"/>
+                <w:b/>
+                <w:sz w:val="32"/>
+                <w:szCs w:val="28"/>
+                <w:lang w:val="it-IT" w:bidi="ta-IN"/>
+              </w:rPr>
+              <w:t>…</w:t>
+            </w:r>
+            <w:r>
+              <w:rPr>
+                <w:rFonts w:ascii="Latha" w:hAnsi="Latha" w:cs="Latha"/>
+                <w:sz w:val="28"/>
+                <w:szCs w:val="28"/>
+                <w:cs/>
+                <w:lang w:bidi="ta-IN"/>
+              </w:rPr>
+              <w:t>வா</w:t>
+            </w:r>
+            <w:r>
+              <w:rPr>
+                <w:rFonts w:ascii="BRH Tamil Tab Extra" w:hAnsi="BRH Tamil Tab Extra" w:cs="Latha"/>
+                <w:b/>
+                <w:sz w:val="32"/>
+                <w:szCs w:val="28"/>
+                <w:lang w:val="it-IT" w:bidi="ta-IN"/>
+              </w:rPr>
+              <w:t>…</w:t>
+            </w:r>
+            <w:r>
+              <w:rPr>
+                <w:rFonts w:ascii="Latha" w:hAnsi="Latha" w:cs="Latha"/>
+                <w:sz w:val="28"/>
+                <w:szCs w:val="28"/>
+                <w:cs/>
+                <w:lang w:bidi="ta-IN"/>
+              </w:rPr>
+              <w:t>ய</w:t>
+            </w:r>
+            <w:r>
+              <w:rPr>
+                <w:rFonts w:ascii="BRH Tamil Tab Extra" w:hAnsi="BRH Tamil Tab Extra" w:cs="Latha"/>
+                <w:b/>
+                <w:sz w:val="32"/>
+                <w:szCs w:val="28"/>
+                <w:lang w:val="it-IT" w:bidi="ta-IN"/>
+              </w:rPr>
+              <w:t>…</w:t>
+            </w:r>
+            <w:r>
+              <w:rPr>
+                <w:rFonts w:ascii="Latha" w:hAnsi="Latha" w:cs="Latha"/>
+                <w:sz w:val="28"/>
+                <w:szCs w:val="28"/>
+                <w:cs/>
+                <w:lang w:bidi="ta-IN"/>
+              </w:rPr>
+              <w:t>வாக்</w:t>
+            </w:r>
+            <w:r>
+              <w:rPr>
+                <w:rFonts w:ascii="Latha" w:hAnsi="Latha" w:cs="Latha"/>
+                <w:b/>
+                <w:bCs/>
+                <w:position w:val="-12"/>
+                <w:sz w:val="28"/>
+                <w:szCs w:val="28"/>
+                <w:cs/>
+                <w:lang w:bidi="ta-IN"/>
+              </w:rPr>
+              <w:t>3</w:t>
+            </w:r>
+            <w:r>
+              <w:rPr>
+                <w:rFonts w:ascii="Latha" w:hAnsi="Latha" w:cs="Latha"/>
+                <w:sz w:val="28"/>
+                <w:szCs w:val="28"/>
+                <w:cs/>
+                <w:lang w:bidi="ta-IN"/>
+              </w:rPr>
+              <w:t>ரா</w:t>
+            </w:r>
+            <w:r>
+              <w:rPr>
+                <w:rFonts w:ascii="BRH Tamil Tab Extra" w:hAnsi="BRH Tamil Tab Extra" w:cs="Latha"/>
+                <w:b/>
+                <w:sz w:val="32"/>
+                <w:szCs w:val="28"/>
+                <w:lang w:val="it-IT" w:bidi="ta-IN"/>
+              </w:rPr>
+              <w:t>…</w:t>
+            </w:r>
+            <w:r>
+              <w:rPr>
+                <w:rFonts w:ascii="Latha" w:hAnsi="Latha" w:cs="Latha"/>
+                <w:sz w:val="28"/>
+                <w:szCs w:val="28"/>
+                <w:lang w:val="it-IT" w:bidi="ta-IN"/>
+              </w:rPr>
+              <w:t xml:space="preserve"> </w:t>
+            </w:r>
+            <w:r>
+              <w:rPr>
+                <w:rFonts w:ascii="Latha" w:hAnsi="Latha" w:cs="Latha"/>
+                <w:sz w:val="28"/>
+                <w:szCs w:val="28"/>
+                <w:cs/>
+                <w:lang w:bidi="ta-IN"/>
+              </w:rPr>
+              <w:t>இத்யை</w:t>
+            </w:r>
+            <w:r>
+              <w:rPr>
+                <w:rFonts w:ascii="BRH Tamil Tab Extra" w:hAnsi="BRH Tamil Tab Extra" w:cs="Latha"/>
+                <w:b/>
+                <w:sz w:val="36"/>
+                <w:szCs w:val="28"/>
+                <w:lang w:val="it-IT" w:bidi="ta-IN"/>
+              </w:rPr>
+              <w:t>‡</w:t>
+            </w:r>
+            <w:r>
+              <w:rPr>
+                <w:rFonts w:ascii="Latha" w:hAnsi="Latha" w:cs="Latha"/>
+                <w:sz w:val="28"/>
+                <w:szCs w:val="28"/>
+                <w:cs/>
+                <w:lang w:bidi="ta-IN"/>
+              </w:rPr>
+              <w:t>ந்த்</w:t>
+            </w:r>
+            <w:r>
+              <w:rPr>
+                <w:rFonts w:ascii="Latha" w:hAnsi="Latha" w:cs="Latha"/>
+                <w:b/>
+                <w:bCs/>
+                <w:position w:val="-12"/>
+                <w:sz w:val="28"/>
+                <w:szCs w:val="28"/>
+                <w:cs/>
+                <w:lang w:bidi="ta-IN"/>
+              </w:rPr>
+              <w:t>3</w:t>
+            </w:r>
+            <w:r>
+              <w:rPr>
+                <w:rFonts w:ascii="Latha" w:hAnsi="Latha" w:cs="Latha"/>
+                <w:sz w:val="28"/>
+                <w:szCs w:val="28"/>
+                <w:cs/>
+                <w:lang w:bidi="ta-IN"/>
+              </w:rPr>
+              <w:t>ரவாய</w:t>
+            </w:r>
+            <w:r>
+              <w:rPr>
+                <w:rFonts w:ascii="BRH Tamil Tab Extra" w:hAnsi="BRH Tamil Tab Extra" w:cs="Latha"/>
+                <w:b/>
+                <w:sz w:val="32"/>
+                <w:szCs w:val="28"/>
+                <w:lang w:val="it-IT" w:bidi="ta-IN"/>
+              </w:rPr>
+              <w:t>…</w:t>
+            </w:r>
+            <w:r>
+              <w:rPr>
+                <w:rFonts w:ascii="Latha" w:hAnsi="Latha" w:cs="Latha"/>
+                <w:sz w:val="28"/>
+                <w:szCs w:val="28"/>
+                <w:cs/>
+                <w:lang w:bidi="ta-IN"/>
+              </w:rPr>
+              <w:t>வ</w:t>
+            </w:r>
+            <w:r>
+              <w:rPr>
+                <w:rFonts w:ascii="Latha" w:hAnsi="Latha" w:cs="Latha"/>
+                <w:sz w:val="28"/>
+                <w:szCs w:val="28"/>
+                <w:lang w:val="it-IT" w:bidi="ta-IN"/>
+              </w:rPr>
+              <w:t xml:space="preserve"> </w:t>
+            </w:r>
+            <w:r>
+              <w:rPr>
+                <w:rFonts w:ascii="Latha" w:hAnsi="Latha" w:cs="Latha"/>
+                <w:sz w:val="28"/>
+                <w:szCs w:val="28"/>
+                <w:lang w:val="it-IT" w:bidi="ta-IN"/>
+              </w:rPr>
+              <w:t>–</w:t>
+            </w:r>
+            <w:r>
+              <w:rPr>
+                <w:rFonts w:ascii="Latha" w:hAnsi="Latha" w:cs="Latha"/>
+                <w:sz w:val="28"/>
+                <w:szCs w:val="28"/>
+                <w:lang w:val="it-IT" w:bidi="ta-IN"/>
+              </w:rPr>
+              <w:t xml:space="preserve"> </w:t>
+            </w:r>
+            <w:r>
+              <w:rPr>
+                <w:rFonts w:ascii="Latha" w:hAnsi="Latha" w:cs="Latha"/>
+                <w:sz w:val="28"/>
+                <w:szCs w:val="28"/>
+                <w:cs/>
+                <w:lang w:bidi="ta-IN"/>
+              </w:rPr>
               <w:t>அ</w:t>
             </w:r>
             <w:r>
@@ -1564,6 +2375,1707 @@
                 <w:sz w:val="28"/>
                 <w:szCs w:val="28"/>
                 <w:lang w:val="it-IT" w:bidi="ta-IN"/>
+              </w:rPr>
+              <w:t xml:space="preserve"> |</w:t>
+            </w:r>
+          </w:p>
+        </w:tc>
+      </w:tr>
+      <w:tr>
+        <w:trPr>
+          <w:trHeight w:val="2523"/>
+        </w:trPr>
+        <w:tc>
+          <w:tcPr>
+            <w:tcW w:w="4048" w:type="dxa"/>
+          </w:tcPr>
+          <w:p>
+            <w:pPr>
+              <w:widowControl w:val="0"/>
+              <w:tabs>
+                <w:tab w:val="left" w:pos="993"/>
+              </w:tabs>
+              <w:autoSpaceDE w:val="0"/>
+              <w:autoSpaceDN w:val="0"/>
+              <w:adjustRightInd w:val="0"/>
+              <w:spacing w:before="0" w:line="252" w:lineRule="auto"/>
+              <w:ind w:right="297"/>
+              <w:rPr>
+                <w:rFonts w:cs="Arial"/>
+                <w:b/>
+                <w:sz w:val="28"/>
+                <w:szCs w:val="32"/>
+              </w:rPr>
+            </w:pPr>
+            <w:r>
+              <w:rPr>
+                <w:rFonts w:cs="Arial"/>
+                <w:b/>
+                <w:sz w:val="28"/>
+                <w:szCs w:val="32"/>
+              </w:rPr>
+              <w:t>T.S.6.4.</w:t>
+            </w:r>
+            <w:r>
+              <w:rPr>
+                <w:rFonts w:cs="Arial"/>
+                <w:b/>
+                <w:sz w:val="28"/>
+                <w:szCs w:val="32"/>
+              </w:rPr>
+              <w:t>8</w:t>
+            </w:r>
+            <w:r>
+              <w:rPr>
+                <w:rFonts w:cs="Arial"/>
+                <w:b/>
+                <w:sz w:val="28"/>
+                <w:szCs w:val="32"/>
+              </w:rPr>
+              <w:t>.1</w:t>
+            </w:r>
+            <w:r>
+              <w:rPr>
+                <w:rFonts w:cs="Arial"/>
+                <w:b/>
+                <w:sz w:val="28"/>
+                <w:szCs w:val="32"/>
+              </w:rPr>
+              <w:t xml:space="preserve"> – Kramam</w:t>
+            </w:r>
+          </w:p>
+          <w:p>
+            <w:pPr>
+              <w:widowControl w:val="0"/>
+              <w:tabs>
+                <w:tab w:val="left" w:pos="993"/>
+              </w:tabs>
+              <w:autoSpaceDE w:val="0"/>
+              <w:autoSpaceDN w:val="0"/>
+              <w:adjustRightInd w:val="0"/>
+              <w:spacing w:before="0" w:line="252" w:lineRule="auto"/>
+              <w:ind w:right="297"/>
+              <w:rPr>
+                <w:rFonts w:cs="Arial"/>
+                <w:b/>
+                <w:sz w:val="28"/>
+                <w:szCs w:val="32"/>
+                <w:lang w:val="en-IN"/>
+              </w:rPr>
+            </w:pPr>
+            <w:r>
+              <w:rPr>
+                <w:rFonts w:cs="Arial"/>
+                <w:b/>
+                <w:sz w:val="28"/>
+                <w:szCs w:val="32"/>
+                <w:lang w:val="en-IN"/>
+              </w:rPr>
+              <w:t>Krama Vaakyam No.–</w:t>
+            </w:r>
+            <w:r>
+              <w:rPr>
+                <w:rFonts w:cs="Arial"/>
+                <w:b/>
+                <w:sz w:val="28"/>
+                <w:szCs w:val="32"/>
+                <w:lang w:val="en-IN"/>
+              </w:rPr>
+              <w:t>30,31</w:t>
+            </w:r>
+          </w:p>
+          <w:p>
+            <w:pPr>
+              <w:widowControl w:val="0"/>
+              <w:autoSpaceDE w:val="0"/>
+              <w:autoSpaceDN w:val="0"/>
+              <w:adjustRightInd w:val="0"/>
+              <w:spacing w:before="0" w:line="264" w:lineRule="auto"/>
+              <w:jc w:val="both"/>
+              <w:rPr>
+                <w:rFonts w:cs="Arial"/>
+                <w:b/>
+                <w:sz w:val="28"/>
+                <w:szCs w:val="32"/>
+                <w:lang w:val="it-IT"/>
+              </w:rPr>
+            </w:pPr>
+            <w:r>
+              <w:rPr>
+                <w:rFonts w:cs="Arial"/>
+                <w:b/>
+                <w:sz w:val="28"/>
+                <w:szCs w:val="32"/>
+                <w:lang w:val="it-IT"/>
+              </w:rPr>
+              <w:t>Panchaati No</w:t>
+            </w:r>
+            <w:r>
+              <w:rPr>
+                <w:rFonts w:cs="Arial"/>
+                <w:b/>
+                <w:szCs w:val="32"/>
+                <w:lang w:val="it-IT"/>
+              </w:rPr>
+              <w:t xml:space="preserve">. – </w:t>
+            </w:r>
+            <w:r>
+              <w:rPr>
+                <w:rFonts w:cs="Arial"/>
+                <w:b/>
+                <w:sz w:val="28"/>
+                <w:szCs w:val="32"/>
+                <w:lang w:val="it-IT"/>
+              </w:rPr>
+              <w:t>3</w:t>
+            </w:r>
+            <w:r>
+              <w:rPr>
+                <w:rFonts w:cs="Arial"/>
+                <w:b/>
+                <w:sz w:val="28"/>
+                <w:szCs w:val="32"/>
+                <w:lang w:val="it-IT"/>
+              </w:rPr>
+              <w:t>4</w:t>
+            </w:r>
+          </w:p>
+          <w:p>
+            <w:pPr>
+              <w:widowControl w:val="0"/>
+              <w:tabs>
+                <w:tab w:val="left" w:pos="993"/>
+              </w:tabs>
+              <w:autoSpaceDE w:val="0"/>
+              <w:autoSpaceDN w:val="0"/>
+              <w:adjustRightInd w:val="0"/>
+              <w:spacing w:before="0" w:line="252" w:lineRule="auto"/>
+              <w:ind w:right="297"/>
+              <w:rPr>
+                <w:rFonts w:cs="Arial"/>
+                <w:b/>
+                <w:sz w:val="28"/>
+                <w:szCs w:val="32"/>
+              </w:rPr>
+            </w:pPr>
+          </w:p>
+        </w:tc>
+        <w:tc>
+          <w:tcPr>
+            <w:tcW w:w="5103" w:type="dxa"/>
+          </w:tcPr>
+          <w:p>
+            <w:pPr>
+              <w:spacing w:before="0" w:line="240" w:lineRule="auto"/>
+              <w:rPr>
+                <w:rFonts w:ascii="Latha" w:hAnsi="Latha" w:cs="Latha"/>
+                <w:sz w:val="28"/>
+                <w:szCs w:val="28"/>
+                <w:cs/>
+                <w:lang w:bidi="ta-IN"/>
+              </w:rPr>
+            </w:pPr>
+            <w:r>
+              <w:rPr>
+                <w:rFonts w:ascii="Latha" w:hAnsi="Latha" w:cs="Latha"/>
+                <w:sz w:val="28"/>
+                <w:szCs w:val="28"/>
+                <w:cs/>
+                <w:lang w:bidi="ta-IN"/>
+              </w:rPr>
+              <w:t>ஸோம</w:t>
+            </w:r>
+            <w:r>
+              <w:rPr>
+                <w:rFonts w:ascii="BRH Devanagari Extra" w:hAnsi="BRH Devanagari Extra" w:cs="Latha"/>
+                <w:b/>
+                <w:sz w:val="36"/>
+                <w:szCs w:val="28"/>
+                <w:lang w:bidi="ta-IN"/>
+              </w:rPr>
+              <w:t>ò</w:t>
+            </w:r>
+            <w:r>
+              <w:rPr>
+                <w:rFonts w:ascii="BRH Tamil Tab Extra" w:hAnsi="BRH Tamil Tab Extra" w:cs="Latha"/>
+                <w:b/>
+                <w:sz w:val="36"/>
+                <w:szCs w:val="28"/>
+                <w:lang w:bidi="ta-IN"/>
+              </w:rPr>
+              <w:t>†</w:t>
+            </w:r>
+            <w:r>
+              <w:rPr>
+                <w:rFonts w:ascii="Latha" w:hAnsi="Latha" w:cs="Latha"/>
+                <w:sz w:val="28"/>
+                <w:szCs w:val="28"/>
+                <w:lang w:bidi="ta-IN"/>
+              </w:rPr>
+              <w:t xml:space="preserve"> </w:t>
+            </w:r>
+            <w:r>
+              <w:rPr>
+                <w:rFonts w:ascii="Latha" w:hAnsi="Latha" w:cs="Latha"/>
+                <w:sz w:val="28"/>
+                <w:szCs w:val="28"/>
+                <w:cs/>
+                <w:lang w:bidi="ta-IN"/>
+              </w:rPr>
+              <w:t>ஶ்ரீ</w:t>
+            </w:r>
+            <w:r>
+              <w:rPr>
+                <w:rFonts w:ascii="Latha" w:hAnsi="Latha" w:cs="Latha"/>
+                <w:sz w:val="28"/>
+                <w:szCs w:val="28"/>
+                <w:highlight w:val="yellow"/>
+                <w:cs/>
+                <w:lang w:bidi="ta-IN"/>
+              </w:rPr>
+              <w:t>ணான்</w:t>
+            </w:r>
+            <w:r>
+              <w:rPr>
+                <w:rFonts w:ascii="Latha" w:hAnsi="Latha" w:cs="Latha"/>
+                <w:sz w:val="28"/>
+                <w:szCs w:val="28"/>
+                <w:lang w:bidi="ta-IN"/>
+              </w:rPr>
+              <w:t xml:space="preserve"> </w:t>
+            </w:r>
+            <w:r>
+              <w:rPr>
+                <w:rFonts w:ascii="Latha" w:hAnsi="Latha" w:cs="Latha"/>
+                <w:sz w:val="28"/>
+                <w:szCs w:val="28"/>
+                <w:lang w:bidi="ta-IN"/>
+              </w:rPr>
+              <w:t xml:space="preserve">| </w:t>
+            </w:r>
+            <w:r>
+              <w:rPr>
+                <w:rFonts w:ascii="Latha" w:hAnsi="Latha" w:cs="Latha"/>
+                <w:sz w:val="28"/>
+                <w:szCs w:val="28"/>
+                <w:highlight w:val="yellow"/>
+                <w:cs/>
+                <w:lang w:bidi="ta-IN"/>
+              </w:rPr>
+              <w:t>ஶ்ரீ</w:t>
+            </w:r>
+            <w:r>
+              <w:rPr>
+                <w:rFonts w:ascii="BRH Tamil Tab Extra" w:hAnsi="BRH Tamil Tab Extra" w:cs="Latha"/>
+                <w:b/>
+                <w:sz w:val="32"/>
+                <w:szCs w:val="28"/>
+                <w:highlight w:val="yellow"/>
+                <w:lang w:bidi="ta-IN"/>
+              </w:rPr>
+              <w:t>…</w:t>
+            </w:r>
+            <w:r>
+              <w:rPr>
+                <w:rFonts w:ascii="Latha" w:hAnsi="Latha" w:cs="Latha"/>
+                <w:sz w:val="28"/>
+                <w:szCs w:val="28"/>
+                <w:highlight w:val="yellow"/>
+                <w:cs/>
+                <w:lang w:bidi="ta-IN"/>
+              </w:rPr>
+              <w:t>ணா</w:t>
+            </w:r>
+            <w:r>
+              <w:rPr>
+                <w:rFonts w:ascii="BRH Tamil Tab Extra" w:hAnsi="BRH Tamil Tab Extra" w:cs="Latha"/>
+                <w:b/>
+                <w:sz w:val="32"/>
+                <w:szCs w:val="28"/>
+                <w:highlight w:val="yellow"/>
+                <w:lang w:bidi="ta-IN"/>
+              </w:rPr>
+              <w:t>…</w:t>
+            </w:r>
+            <w:r>
+              <w:rPr>
+                <w:rFonts w:ascii="Latha" w:hAnsi="Latha" w:cs="Latha"/>
+                <w:sz w:val="28"/>
+                <w:szCs w:val="28"/>
+                <w:highlight w:val="yellow"/>
+                <w:cs/>
+                <w:lang w:bidi="ta-IN"/>
+              </w:rPr>
+              <w:t>னி</w:t>
+            </w:r>
+            <w:r>
+              <w:rPr>
+                <w:rFonts w:ascii="Latha" w:hAnsi="Latha" w:cs="Latha"/>
+                <w:sz w:val="28"/>
+                <w:szCs w:val="28"/>
+                <w:cs/>
+                <w:lang w:bidi="ta-IN"/>
+              </w:rPr>
+              <w:t>தி</w:t>
+            </w:r>
+            <w:r>
+              <w:rPr>
+                <w:rFonts w:ascii="BRH Tamil Tab Extra" w:hAnsi="BRH Tamil Tab Extra" w:cs="Latha"/>
+                <w:b/>
+                <w:sz w:val="36"/>
+                <w:szCs w:val="28"/>
+                <w:lang w:bidi="ta-IN"/>
+              </w:rPr>
+              <w:t>†</w:t>
+            </w:r>
+            <w:r>
+              <w:rPr>
+                <w:rFonts w:ascii="Latha" w:hAnsi="Latha" w:cs="Latha"/>
+                <w:sz w:val="28"/>
+                <w:szCs w:val="28"/>
+                <w:lang w:bidi="ta-IN"/>
+              </w:rPr>
+              <w:t xml:space="preserve"> |</w:t>
+            </w:r>
+          </w:p>
+        </w:tc>
+        <w:tc>
+          <w:tcPr>
+            <w:tcW w:w="5811" w:type="dxa"/>
+          </w:tcPr>
+          <w:p>
+            <w:pPr>
+              <w:spacing w:before="0" w:line="240" w:lineRule="auto"/>
+              <w:rPr>
+                <w:rFonts w:ascii="Latha" w:hAnsi="Latha" w:cs="Latha"/>
+                <w:sz w:val="28"/>
+                <w:szCs w:val="28"/>
+                <w:cs/>
+                <w:lang w:bidi="ta-IN"/>
+              </w:rPr>
+            </w:pPr>
+            <w:r>
+              <w:rPr>
+                <w:rFonts w:ascii="Latha" w:hAnsi="Latha" w:cs="Latha"/>
+                <w:sz w:val="28"/>
+                <w:szCs w:val="28"/>
+                <w:cs/>
+                <w:lang w:bidi="ta-IN"/>
+              </w:rPr>
+              <w:t>ஸோம</w:t>
+            </w:r>
+            <w:r>
+              <w:rPr>
+                <w:rFonts w:ascii="BRH Devanagari Extra" w:hAnsi="BRH Devanagari Extra" w:cs="Latha"/>
+                <w:b/>
+                <w:sz w:val="36"/>
+                <w:szCs w:val="28"/>
+                <w:lang w:bidi="ta-IN"/>
+              </w:rPr>
+              <w:t>ò</w:t>
+            </w:r>
+            <w:r>
+              <w:rPr>
+                <w:rFonts w:ascii="BRH Tamil Tab Extra" w:hAnsi="BRH Tamil Tab Extra" w:cs="Latha"/>
+                <w:b/>
+                <w:sz w:val="36"/>
+                <w:szCs w:val="28"/>
+                <w:lang w:bidi="ta-IN"/>
+              </w:rPr>
+              <w:t>†</w:t>
+            </w:r>
+            <w:r>
+              <w:rPr>
+                <w:rFonts w:ascii="Latha" w:hAnsi="Latha" w:cs="Latha"/>
+                <w:sz w:val="28"/>
+                <w:szCs w:val="28"/>
+                <w:lang w:bidi="ta-IN"/>
+              </w:rPr>
+              <w:t xml:space="preserve"> </w:t>
+            </w:r>
+            <w:r>
+              <w:rPr>
+                <w:rFonts w:ascii="Latha" w:hAnsi="Latha" w:cs="Latha"/>
+                <w:sz w:val="28"/>
+                <w:szCs w:val="28"/>
+                <w:cs/>
+                <w:lang w:bidi="ta-IN"/>
+              </w:rPr>
+              <w:t>ஶ்ரீ</w:t>
+            </w:r>
+            <w:r>
+              <w:rPr>
+                <w:rFonts w:ascii="Latha" w:hAnsi="Latha" w:cs="Latha"/>
+                <w:sz w:val="28"/>
+                <w:szCs w:val="28"/>
+                <w:highlight w:val="green"/>
+                <w:cs/>
+                <w:lang w:bidi="ta-IN"/>
+              </w:rPr>
+              <w:t>ணன்ன்</w:t>
+            </w:r>
+            <w:r>
+              <w:rPr>
+                <w:rFonts w:ascii="Latha" w:hAnsi="Latha" w:cs="Latha"/>
+                <w:sz w:val="28"/>
+                <w:szCs w:val="28"/>
+                <w:lang w:bidi="ta-IN"/>
+              </w:rPr>
+              <w:t xml:space="preserve"> | </w:t>
+            </w:r>
+            <w:r>
+              <w:rPr>
+                <w:rFonts w:ascii="Latha" w:hAnsi="Latha" w:cs="Latha"/>
+                <w:sz w:val="28"/>
+                <w:szCs w:val="28"/>
+                <w:lang w:bidi="ta-IN"/>
+              </w:rPr>
+              <w:br/>
+            </w:r>
+            <w:r>
+              <w:rPr>
+                <w:rFonts w:ascii="Latha" w:hAnsi="Latha" w:cs="Latha"/>
+                <w:sz w:val="28"/>
+                <w:szCs w:val="28"/>
+                <w:cs/>
+                <w:lang w:bidi="ta-IN"/>
+                <w14:ligatures w14:val="standardContextual"/>
+              </w:rPr>
+              <w:t>ஸ்ரீ</w:t>
+            </w:r>
+            <w:r>
+              <w:rPr>
+                <w:rFonts w:ascii="BRH Tamil Tab Extra" w:hAnsi="BRH Tamil Tab Extra" w:cs="Latha"/>
+                <w:b/>
+                <w:bCs/>
+                <w:sz w:val="28"/>
+                <w:szCs w:val="28"/>
+                <w:lang w:bidi="ta-IN"/>
+                <w14:ligatures w14:val="standardContextual"/>
+              </w:rPr>
+              <w:t>…</w:t>
+            </w:r>
+            <w:r>
+              <w:rPr>
+                <w:rFonts w:ascii="Latha" w:hAnsi="Latha" w:cs="Latha"/>
+                <w:sz w:val="28"/>
+                <w:szCs w:val="28"/>
+                <w:highlight w:val="green"/>
+                <w:cs/>
+                <w:lang w:bidi="ta-IN"/>
+                <w14:ligatures w14:val="standardContextual"/>
+              </w:rPr>
+              <w:t>ண</w:t>
+            </w:r>
+            <w:r>
+              <w:rPr>
+                <w:rFonts w:ascii="BRH Tamil Tab Extra" w:hAnsi="BRH Tamil Tab Extra" w:cs="Latha"/>
+                <w:b/>
+                <w:bCs/>
+                <w:sz w:val="28"/>
+                <w:szCs w:val="28"/>
+                <w:highlight w:val="green"/>
+                <w:lang w:bidi="ta-IN"/>
+                <w14:ligatures w14:val="standardContextual"/>
+              </w:rPr>
+              <w:t>…</w:t>
+            </w:r>
+            <w:r>
+              <w:rPr>
+                <w:rFonts w:ascii="Latha" w:hAnsi="Latha" w:cs="Latha"/>
+                <w:sz w:val="28"/>
+                <w:szCs w:val="28"/>
+                <w:highlight w:val="green"/>
+                <w:cs/>
+                <w:lang w:bidi="ta-IN"/>
+                <w14:ligatures w14:val="standardContextual"/>
+              </w:rPr>
+              <w:t>ன்</w:t>
+            </w:r>
+            <w:r>
+              <w:rPr>
+                <w:rFonts w:ascii="Latha" w:hAnsi="Latha" w:cs="Latha"/>
+                <w:sz w:val="28"/>
+                <w:szCs w:val="28"/>
+                <w:highlight w:val="green"/>
+                <w:lang w:bidi="ta-IN"/>
+                <w14:ligatures w14:val="standardContextual"/>
+              </w:rPr>
+              <w:t>-</w:t>
+            </w:r>
+            <w:r>
+              <w:rPr>
+                <w:rFonts w:ascii="Latha" w:hAnsi="Latha" w:cs="Latha"/>
+                <w:sz w:val="28"/>
+                <w:szCs w:val="28"/>
+                <w:highlight w:val="green"/>
+                <w:cs/>
+                <w:lang w:bidi="ta-IN"/>
+                <w14:ligatures w14:val="standardContextual"/>
+              </w:rPr>
+              <w:t>னி</w:t>
+            </w:r>
+            <w:r>
+              <w:rPr>
+                <w:rFonts w:ascii="Latha" w:hAnsi="Latha" w:cs="Latha"/>
+                <w:sz w:val="28"/>
+                <w:szCs w:val="28"/>
+                <w:cs/>
+                <w:lang w:bidi="ta-IN"/>
+              </w:rPr>
+              <w:t>தி</w:t>
+            </w:r>
+            <w:r>
+              <w:rPr>
+                <w:rFonts w:ascii="BRH Tamil Tab Extra" w:hAnsi="BRH Tamil Tab Extra" w:cs="Latha"/>
+                <w:b/>
+                <w:sz w:val="36"/>
+                <w:szCs w:val="28"/>
+                <w:lang w:bidi="ta-IN"/>
+              </w:rPr>
+              <w:t>†</w:t>
+            </w:r>
+            <w:r>
+              <w:rPr>
+                <w:rFonts w:ascii="Latha" w:hAnsi="Latha" w:cs="Latha"/>
+                <w:sz w:val="28"/>
+                <w:szCs w:val="28"/>
+                <w:lang w:bidi="ta-IN"/>
+              </w:rPr>
+              <w:t xml:space="preserve"> |</w:t>
+            </w:r>
+          </w:p>
+        </w:tc>
+      </w:tr>
+      <w:tr>
+        <w:trPr>
+          <w:trHeight w:val="1266"/>
+        </w:trPr>
+        <w:tc>
+          <w:tcPr>
+            <w:tcW w:w="4048" w:type="dxa"/>
+          </w:tcPr>
+          <w:p>
+            <w:pPr>
+              <w:widowControl w:val="0"/>
+              <w:tabs>
+                <w:tab w:val="left" w:pos="993"/>
+              </w:tabs>
+              <w:autoSpaceDE w:val="0"/>
+              <w:autoSpaceDN w:val="0"/>
+              <w:adjustRightInd w:val="0"/>
+              <w:spacing w:before="0" w:line="252" w:lineRule="auto"/>
+              <w:ind w:right="297"/>
+              <w:rPr>
+                <w:rFonts w:cs="Arial"/>
+                <w:b/>
+                <w:sz w:val="28"/>
+                <w:szCs w:val="32"/>
+              </w:rPr>
+            </w:pPr>
+            <w:r>
+              <w:rPr>
+                <w:rFonts w:cs="Arial"/>
+                <w:b/>
+                <w:sz w:val="28"/>
+                <w:szCs w:val="32"/>
+              </w:rPr>
+              <w:lastRenderedPageBreak/>
+              <w:t>T.S.6.4.</w:t>
+            </w:r>
+            <w:r>
+              <w:rPr>
+                <w:rFonts w:cs="Arial"/>
+                <w:b/>
+                <w:sz w:val="28"/>
+                <w:szCs w:val="32"/>
+              </w:rPr>
+              <w:t>11</w:t>
+            </w:r>
+            <w:r>
+              <w:rPr>
+                <w:rFonts w:cs="Arial"/>
+                <w:b/>
+                <w:sz w:val="28"/>
+                <w:szCs w:val="32"/>
+              </w:rPr>
+              <w:t>.1</w:t>
+            </w:r>
+            <w:r>
+              <w:rPr>
+                <w:rFonts w:cs="Arial"/>
+                <w:b/>
+                <w:sz w:val="28"/>
+                <w:szCs w:val="32"/>
+              </w:rPr>
+              <w:t xml:space="preserve"> – Kramam</w:t>
+            </w:r>
+          </w:p>
+          <w:p>
+            <w:pPr>
+              <w:widowControl w:val="0"/>
+              <w:tabs>
+                <w:tab w:val="left" w:pos="993"/>
+              </w:tabs>
+              <w:autoSpaceDE w:val="0"/>
+              <w:autoSpaceDN w:val="0"/>
+              <w:adjustRightInd w:val="0"/>
+              <w:spacing w:before="0" w:line="252" w:lineRule="auto"/>
+              <w:ind w:right="297"/>
+              <w:rPr>
+                <w:rFonts w:cs="Arial"/>
+                <w:b/>
+                <w:sz w:val="28"/>
+                <w:szCs w:val="32"/>
+                <w:lang w:val="en-IN"/>
+              </w:rPr>
+            </w:pPr>
+            <w:r>
+              <w:rPr>
+                <w:rFonts w:cs="Arial"/>
+                <w:b/>
+                <w:sz w:val="28"/>
+                <w:szCs w:val="32"/>
+                <w:lang w:val="en-IN"/>
+              </w:rPr>
+              <w:t>Krama Vaakyam No.–</w:t>
+            </w:r>
+            <w:r>
+              <w:rPr>
+                <w:rFonts w:cs="Arial"/>
+                <w:b/>
+                <w:sz w:val="28"/>
+                <w:szCs w:val="32"/>
+                <w:lang w:val="en-IN"/>
+              </w:rPr>
+              <w:t xml:space="preserve"> 28</w:t>
+            </w:r>
+          </w:p>
+          <w:p>
+            <w:pPr>
+              <w:widowControl w:val="0"/>
+              <w:autoSpaceDE w:val="0"/>
+              <w:autoSpaceDN w:val="0"/>
+              <w:adjustRightInd w:val="0"/>
+              <w:spacing w:before="0" w:line="264" w:lineRule="auto"/>
+              <w:jc w:val="both"/>
+              <w:rPr>
+                <w:rFonts w:cs="Arial"/>
+                <w:b/>
+                <w:sz w:val="28"/>
+                <w:szCs w:val="28"/>
+                <w:lang w:val="it-IT"/>
+              </w:rPr>
+            </w:pPr>
+            <w:r>
+              <w:rPr>
+                <w:rFonts w:cs="Arial"/>
+                <w:b/>
+                <w:sz w:val="28"/>
+                <w:szCs w:val="32"/>
+                <w:lang w:val="it-IT"/>
+              </w:rPr>
+              <w:t>Panchaati No</w:t>
+            </w:r>
+            <w:r>
+              <w:rPr>
+                <w:rFonts w:cs="Arial"/>
+                <w:b/>
+                <w:szCs w:val="32"/>
+                <w:lang w:val="it-IT"/>
+              </w:rPr>
+              <w:t>. –</w:t>
+            </w:r>
+            <w:r>
+              <w:rPr>
+                <w:rFonts w:cs="Arial"/>
+                <w:b/>
+                <w:sz w:val="28"/>
+                <w:szCs w:val="28"/>
+                <w:lang w:val="it-IT"/>
+              </w:rPr>
+              <w:t xml:space="preserve"> </w:t>
+            </w:r>
+            <w:r>
+              <w:rPr>
+                <w:rFonts w:cs="Arial"/>
+                <w:b/>
+                <w:sz w:val="28"/>
+                <w:szCs w:val="28"/>
+                <w:lang w:val="it-IT"/>
+              </w:rPr>
+              <w:t>48</w:t>
+            </w:r>
+          </w:p>
+          <w:p>
+            <w:pPr>
+              <w:widowControl w:val="0"/>
+              <w:tabs>
+                <w:tab w:val="left" w:pos="993"/>
+              </w:tabs>
+              <w:autoSpaceDE w:val="0"/>
+              <w:autoSpaceDN w:val="0"/>
+              <w:adjustRightInd w:val="0"/>
+              <w:spacing w:before="0" w:line="252" w:lineRule="auto"/>
+              <w:ind w:right="297"/>
+              <w:rPr>
+                <w:rFonts w:cs="Arial"/>
+                <w:b/>
+                <w:sz w:val="28"/>
+                <w:szCs w:val="32"/>
+              </w:rPr>
+            </w:pPr>
+          </w:p>
+        </w:tc>
+        <w:tc>
+          <w:tcPr>
+            <w:tcW w:w="5103" w:type="dxa"/>
+          </w:tcPr>
+          <w:p>
+            <w:pPr>
+              <w:spacing w:before="0" w:line="240" w:lineRule="auto"/>
+              <w:rPr>
+                <w:rFonts w:ascii="Latha" w:hAnsi="Latha" w:cs="Latha"/>
+                <w:sz w:val="28"/>
+                <w:szCs w:val="28"/>
+                <w:cs/>
+                <w:lang w:bidi="ta-IN"/>
+              </w:rPr>
+            </w:pPr>
+            <w:r>
+              <w:rPr>
+                <w:rFonts w:ascii="Latha" w:hAnsi="Latha" w:cs="Latha"/>
+                <w:sz w:val="28"/>
+                <w:szCs w:val="28"/>
+                <w:highlight w:val="yellow"/>
+                <w:cs/>
+                <w:lang w:bidi="ta-IN"/>
+              </w:rPr>
+              <w:t>க்</w:t>
+            </w:r>
+            <w:r>
+              <w:rPr>
+                <w:rFonts w:ascii="Latha" w:hAnsi="Latha" w:cs="Latha"/>
+                <w:b/>
+                <w:bCs/>
+                <w:position w:val="-12"/>
+                <w:sz w:val="28"/>
+                <w:szCs w:val="28"/>
+                <w:highlight w:val="yellow"/>
+                <w:cs/>
+                <w:lang w:bidi="ta-IN"/>
+              </w:rPr>
+              <w:t>3</w:t>
+            </w:r>
+            <w:r>
+              <w:rPr>
+                <w:rFonts w:ascii="Latha" w:hAnsi="Latha" w:cs="Latha"/>
+                <w:b/>
+                <w:bCs/>
+                <w:i/>
+                <w:iCs/>
+                <w:sz w:val="28"/>
+                <w:szCs w:val="28"/>
+                <w:highlight w:val="yellow"/>
+                <w:cs/>
+                <w:lang w:bidi="ta-IN"/>
+              </w:rPr>
+              <w:t>ரு</w:t>
+            </w:r>
+            <w:r>
+              <w:rPr>
+                <w:rFonts w:ascii="Latha" w:hAnsi="Latha" w:cs="Latha"/>
+                <w:sz w:val="28"/>
+                <w:szCs w:val="28"/>
+                <w:cs/>
+                <w:lang w:bidi="ta-IN"/>
+              </w:rPr>
+              <w:t>ஹா</w:t>
+            </w:r>
+            <w:r>
+              <w:rPr>
+                <w:rFonts w:ascii="BRH Tamil Tab Extra" w:hAnsi="BRH Tamil Tab Extra" w:cs="Latha"/>
+                <w:b/>
+                <w:sz w:val="36"/>
+                <w:szCs w:val="28"/>
+                <w:lang w:bidi="ta-IN"/>
+              </w:rPr>
+              <w:t>†</w:t>
+            </w:r>
+            <w:r>
+              <w:rPr>
+                <w:rFonts w:ascii="Latha" w:hAnsi="Latha" w:cs="Latha"/>
+                <w:sz w:val="28"/>
+                <w:szCs w:val="28"/>
+                <w:lang w:bidi="ta-IN"/>
+              </w:rPr>
+              <w:t xml:space="preserve"> </w:t>
+            </w:r>
+            <w:r>
+              <w:rPr>
+                <w:rFonts w:ascii="Latha" w:hAnsi="Latha" w:cs="Latha"/>
+                <w:sz w:val="28"/>
+                <w:szCs w:val="28"/>
+                <w:cs/>
+                <w:lang w:bidi="ta-IN"/>
+              </w:rPr>
+              <w:t>க்</w:t>
+            </w:r>
+            <w:r>
+              <w:rPr>
+                <w:rFonts w:ascii="Latha" w:hAnsi="Latha" w:cs="Latha"/>
+                <w:b/>
+                <w:bCs/>
+                <w:position w:val="-12"/>
+                <w:sz w:val="28"/>
+                <w:szCs w:val="28"/>
+                <w:cs/>
+                <w:lang w:bidi="ta-IN"/>
+              </w:rPr>
+              <w:t>3</w:t>
+            </w:r>
+            <w:r>
+              <w:rPr>
+                <w:rFonts w:ascii="Latha" w:hAnsi="Latha" w:cs="Latha"/>
+                <w:b/>
+                <w:bCs/>
+                <w:i/>
+                <w:iCs/>
+                <w:sz w:val="28"/>
+                <w:szCs w:val="28"/>
+                <w:cs/>
+                <w:lang w:bidi="ta-IN"/>
+              </w:rPr>
+              <w:t>ரு</w:t>
+            </w:r>
+            <w:r>
+              <w:rPr>
+                <w:rFonts w:ascii="BRH Tamil Tab Extra" w:hAnsi="BRH Tamil Tab Extra" w:cs="Latha"/>
+                <w:b/>
+                <w:sz w:val="32"/>
+                <w:szCs w:val="28"/>
+                <w:lang w:bidi="ta-IN"/>
+              </w:rPr>
+              <w:t>…</w:t>
+            </w:r>
+            <w:r>
+              <w:rPr>
+                <w:rFonts w:ascii="Latha" w:hAnsi="Latha" w:cs="Latha"/>
+                <w:sz w:val="28"/>
+                <w:szCs w:val="28"/>
+                <w:cs/>
+                <w:lang w:bidi="ta-IN"/>
+              </w:rPr>
+              <w:t>ஹ்யந்தே</w:t>
+            </w:r>
+            <w:r>
+              <w:rPr>
+                <w:rFonts w:ascii="BRH Tamil Tab Extra" w:hAnsi="BRH Tamil Tab Extra" w:cs="Latha"/>
+                <w:b/>
+                <w:sz w:val="36"/>
+                <w:szCs w:val="28"/>
+                <w:lang w:bidi="ta-IN"/>
+              </w:rPr>
+              <w:t>‡</w:t>
+            </w:r>
+            <w:r>
+              <w:rPr>
+                <w:rFonts w:ascii="Latha" w:hAnsi="Latha" w:cs="Latha"/>
+                <w:sz w:val="28"/>
+                <w:szCs w:val="28"/>
+                <w:lang w:bidi="ta-IN"/>
+              </w:rPr>
+              <w:t xml:space="preserve"> |</w:t>
+            </w:r>
+          </w:p>
+        </w:tc>
+        <w:tc>
+          <w:tcPr>
+            <w:tcW w:w="5811" w:type="dxa"/>
+          </w:tcPr>
+          <w:p>
+            <w:pPr>
+              <w:spacing w:before="0" w:line="240" w:lineRule="auto"/>
+              <w:rPr>
+                <w:rFonts w:ascii="Latha" w:hAnsi="Latha" w:cs="Latha"/>
+                <w:sz w:val="28"/>
+                <w:szCs w:val="28"/>
+                <w:cs/>
+                <w:lang w:bidi="ta-IN"/>
+              </w:rPr>
+            </w:pPr>
+            <w:r>
+              <w:rPr>
+                <w:rFonts w:ascii="Latha" w:hAnsi="Latha" w:cs="Latha"/>
+                <w:sz w:val="28"/>
+                <w:szCs w:val="28"/>
+                <w:highlight w:val="green"/>
+                <w:cs/>
+                <w:lang w:bidi="ta-IN"/>
+              </w:rPr>
+              <w:t>க்</w:t>
+            </w:r>
+            <w:r>
+              <w:rPr>
+                <w:rFonts w:ascii="Latha" w:hAnsi="Latha" w:cs="Latha"/>
+                <w:b/>
+                <w:bCs/>
+                <w:position w:val="-12"/>
+                <w:sz w:val="28"/>
+                <w:szCs w:val="28"/>
+                <w:highlight w:val="green"/>
+                <w:cs/>
+                <w:lang w:bidi="ta-IN"/>
+              </w:rPr>
+              <w:t>3</w:t>
+            </w:r>
+            <w:r>
+              <w:rPr>
+                <w:rFonts w:ascii="Latha" w:hAnsi="Latha" w:cs="Latha"/>
+                <w:sz w:val="28"/>
+                <w:szCs w:val="28"/>
+                <w:highlight w:val="green"/>
+                <w:cs/>
+                <w:lang w:bidi="ta-IN"/>
+              </w:rPr>
+              <w:t>ர</w:t>
+            </w:r>
+            <w:r>
+              <w:rPr>
+                <w:rFonts w:ascii="Latha" w:hAnsi="Latha" w:cs="Latha"/>
+                <w:sz w:val="28"/>
+                <w:szCs w:val="28"/>
+                <w:cs/>
+                <w:lang w:bidi="ta-IN"/>
+              </w:rPr>
+              <w:t>ஹா</w:t>
+            </w:r>
+            <w:r>
+              <w:rPr>
+                <w:rFonts w:ascii="BRH Tamil Tab Extra" w:hAnsi="BRH Tamil Tab Extra" w:cs="Latha"/>
+                <w:b/>
+                <w:sz w:val="36"/>
+                <w:szCs w:val="28"/>
+                <w:lang w:bidi="ta-IN"/>
+              </w:rPr>
+              <w:t>†</w:t>
+            </w:r>
+            <w:r>
+              <w:rPr>
+                <w:rFonts w:ascii="Latha" w:hAnsi="Latha" w:cs="Latha"/>
+                <w:sz w:val="28"/>
+                <w:szCs w:val="28"/>
+                <w:lang w:bidi="ta-IN"/>
+              </w:rPr>
+              <w:t xml:space="preserve"> </w:t>
+            </w:r>
+            <w:r>
+              <w:rPr>
+                <w:rFonts w:ascii="Latha" w:hAnsi="Latha" w:cs="Latha"/>
+                <w:sz w:val="28"/>
+                <w:szCs w:val="28"/>
+                <w:cs/>
+                <w:lang w:bidi="ta-IN"/>
+              </w:rPr>
+              <w:t>க்</w:t>
+            </w:r>
+            <w:r>
+              <w:rPr>
+                <w:rFonts w:ascii="Latha" w:hAnsi="Latha" w:cs="Latha"/>
+                <w:b/>
+                <w:bCs/>
+                <w:position w:val="-12"/>
+                <w:sz w:val="28"/>
+                <w:szCs w:val="28"/>
+                <w:cs/>
+                <w:lang w:bidi="ta-IN"/>
+              </w:rPr>
+              <w:t>3</w:t>
+            </w:r>
+            <w:r>
+              <w:rPr>
+                <w:rFonts w:ascii="Latha" w:hAnsi="Latha" w:cs="Latha"/>
+                <w:b/>
+                <w:bCs/>
+                <w:i/>
+                <w:iCs/>
+                <w:sz w:val="28"/>
+                <w:szCs w:val="28"/>
+                <w:cs/>
+                <w:lang w:bidi="ta-IN"/>
+              </w:rPr>
+              <w:t>ரு</w:t>
+            </w:r>
+            <w:r>
+              <w:rPr>
+                <w:rFonts w:ascii="BRH Tamil Tab Extra" w:hAnsi="BRH Tamil Tab Extra" w:cs="Latha"/>
+                <w:b/>
+                <w:sz w:val="32"/>
+                <w:szCs w:val="28"/>
+                <w:lang w:bidi="ta-IN"/>
+              </w:rPr>
+              <w:t>…</w:t>
+            </w:r>
+            <w:r>
+              <w:rPr>
+                <w:rFonts w:ascii="Latha" w:hAnsi="Latha" w:cs="Latha"/>
+                <w:sz w:val="28"/>
+                <w:szCs w:val="28"/>
+                <w:cs/>
+                <w:lang w:bidi="ta-IN"/>
+              </w:rPr>
+              <w:t>ஹ்யந்தே</w:t>
+            </w:r>
+            <w:r>
+              <w:rPr>
+                <w:rFonts w:ascii="BRH Tamil Tab Extra" w:hAnsi="BRH Tamil Tab Extra" w:cs="Latha"/>
+                <w:b/>
+                <w:sz w:val="36"/>
+                <w:szCs w:val="28"/>
+                <w:lang w:bidi="ta-IN"/>
+              </w:rPr>
+              <w:t>‡</w:t>
+            </w:r>
+            <w:r>
+              <w:rPr>
+                <w:rFonts w:ascii="Latha" w:hAnsi="Latha" w:cs="Latha"/>
+                <w:sz w:val="28"/>
+                <w:szCs w:val="28"/>
+                <w:lang w:bidi="ta-IN"/>
+              </w:rPr>
+              <w:t xml:space="preserve"> |</w:t>
+            </w:r>
+          </w:p>
+        </w:tc>
+      </w:tr>
+      <w:tr>
+        <w:trPr>
+          <w:trHeight w:val="1266"/>
+        </w:trPr>
+        <w:tc>
+          <w:tcPr>
+            <w:tcW w:w="4048" w:type="dxa"/>
+          </w:tcPr>
+          <w:p>
+            <w:pPr>
+              <w:widowControl w:val="0"/>
+              <w:tabs>
+                <w:tab w:val="left" w:pos="993"/>
+              </w:tabs>
+              <w:autoSpaceDE w:val="0"/>
+              <w:autoSpaceDN w:val="0"/>
+              <w:adjustRightInd w:val="0"/>
+              <w:spacing w:before="0" w:line="252" w:lineRule="auto"/>
+              <w:ind w:right="297"/>
+              <w:rPr>
+                <w:rFonts w:cs="Arial"/>
+                <w:b/>
+                <w:sz w:val="28"/>
+                <w:szCs w:val="32"/>
+              </w:rPr>
+            </w:pPr>
+            <w:r>
+              <w:rPr>
+                <w:rFonts w:cs="Arial"/>
+                <w:b/>
+                <w:sz w:val="28"/>
+                <w:szCs w:val="32"/>
+              </w:rPr>
+              <w:t>T.S.6.4.</w:t>
+            </w:r>
+            <w:r>
+              <w:rPr>
+                <w:rFonts w:cs="Arial"/>
+                <w:b/>
+                <w:sz w:val="28"/>
+                <w:szCs w:val="32"/>
+              </w:rPr>
+              <w:t>11.</w:t>
+            </w:r>
+            <w:r>
+              <w:rPr>
+                <w:rFonts w:cs="Arial"/>
+                <w:b/>
+                <w:sz w:val="28"/>
+                <w:szCs w:val="32"/>
+              </w:rPr>
+              <w:t>2</w:t>
+            </w:r>
+            <w:r>
+              <w:rPr>
+                <w:rFonts w:cs="Arial"/>
+                <w:b/>
+                <w:sz w:val="28"/>
+                <w:szCs w:val="32"/>
+              </w:rPr>
+              <w:t xml:space="preserve"> – Kramam</w:t>
+            </w:r>
+          </w:p>
+          <w:p>
+            <w:pPr>
+              <w:widowControl w:val="0"/>
+              <w:tabs>
+                <w:tab w:val="left" w:pos="993"/>
+              </w:tabs>
+              <w:autoSpaceDE w:val="0"/>
+              <w:autoSpaceDN w:val="0"/>
+              <w:adjustRightInd w:val="0"/>
+              <w:spacing w:before="0" w:line="252" w:lineRule="auto"/>
+              <w:ind w:right="297"/>
+              <w:rPr>
+                <w:rFonts w:cs="Arial"/>
+                <w:b/>
+                <w:sz w:val="28"/>
+                <w:szCs w:val="32"/>
+                <w:lang w:val="en-IN"/>
+              </w:rPr>
+            </w:pPr>
+            <w:r>
+              <w:rPr>
+                <w:rFonts w:cs="Arial"/>
+                <w:b/>
+                <w:sz w:val="28"/>
+                <w:szCs w:val="32"/>
+                <w:lang w:val="en-IN"/>
+              </w:rPr>
+              <w:t>Krama Vaakyam No.–</w:t>
+            </w:r>
+            <w:r>
+              <w:rPr>
+                <w:rFonts w:cs="Arial"/>
+                <w:b/>
+                <w:sz w:val="28"/>
+                <w:szCs w:val="32"/>
+                <w:lang w:val="en-IN"/>
+              </w:rPr>
+              <w:t xml:space="preserve"> </w:t>
+            </w:r>
+            <w:r>
+              <w:rPr>
+                <w:rFonts w:cs="Arial"/>
+                <w:b/>
+                <w:sz w:val="28"/>
+                <w:szCs w:val="32"/>
+                <w:lang w:val="en-IN"/>
+              </w:rPr>
+              <w:t>35</w:t>
+            </w:r>
+          </w:p>
+          <w:p>
+            <w:pPr>
+              <w:widowControl w:val="0"/>
+              <w:autoSpaceDE w:val="0"/>
+              <w:autoSpaceDN w:val="0"/>
+              <w:adjustRightInd w:val="0"/>
+              <w:spacing w:before="0" w:line="264" w:lineRule="auto"/>
+              <w:jc w:val="both"/>
+              <w:rPr>
+                <w:rFonts w:cs="Arial"/>
+                <w:b/>
+                <w:sz w:val="28"/>
+                <w:szCs w:val="28"/>
+                <w:lang w:val="it-IT"/>
+              </w:rPr>
+            </w:pPr>
+            <w:r>
+              <w:rPr>
+                <w:rFonts w:cs="Arial"/>
+                <w:b/>
+                <w:sz w:val="28"/>
+                <w:szCs w:val="32"/>
+                <w:lang w:val="it-IT"/>
+              </w:rPr>
+              <w:t>Panchaati No</w:t>
+            </w:r>
+            <w:r>
+              <w:rPr>
+                <w:rFonts w:cs="Arial"/>
+                <w:b/>
+                <w:szCs w:val="32"/>
+                <w:lang w:val="it-IT"/>
+              </w:rPr>
+              <w:t>. –</w:t>
+            </w:r>
+            <w:r>
+              <w:rPr>
+                <w:rFonts w:cs="Arial"/>
+                <w:b/>
+                <w:sz w:val="28"/>
+                <w:szCs w:val="28"/>
+                <w:lang w:val="it-IT"/>
+              </w:rPr>
+              <w:t xml:space="preserve"> 4</w:t>
+            </w:r>
+            <w:r>
+              <w:rPr>
+                <w:rFonts w:cs="Arial"/>
+                <w:b/>
+                <w:sz w:val="28"/>
+                <w:szCs w:val="28"/>
+                <w:lang w:val="it-IT"/>
+              </w:rPr>
+              <w:t>9</w:t>
+            </w:r>
+          </w:p>
+          <w:p>
+            <w:pPr>
+              <w:widowControl w:val="0"/>
+              <w:tabs>
+                <w:tab w:val="left" w:pos="993"/>
+              </w:tabs>
+              <w:autoSpaceDE w:val="0"/>
+              <w:autoSpaceDN w:val="0"/>
+              <w:adjustRightInd w:val="0"/>
+              <w:spacing w:before="0" w:line="252" w:lineRule="auto"/>
+              <w:ind w:right="297"/>
+              <w:rPr>
+                <w:rFonts w:cs="Arial"/>
+                <w:b/>
+                <w:sz w:val="28"/>
+                <w:szCs w:val="32"/>
+              </w:rPr>
+            </w:pPr>
+          </w:p>
+        </w:tc>
+        <w:tc>
+          <w:tcPr>
+            <w:tcW w:w="5103" w:type="dxa"/>
+          </w:tcPr>
+          <w:p>
+            <w:pPr>
+              <w:spacing w:before="0" w:line="240" w:lineRule="auto"/>
+              <w:rPr>
+                <w:rFonts w:ascii="Latha" w:hAnsi="Latha" w:cs="Latha"/>
+                <w:sz w:val="28"/>
+                <w:szCs w:val="28"/>
+                <w:cs/>
+                <w:lang w:bidi="ta-IN"/>
+              </w:rPr>
+            </w:pPr>
+            <w:r>
+              <w:rPr>
+                <w:rFonts w:ascii="Latha" w:hAnsi="Latha" w:cs="Latha"/>
+                <w:sz w:val="28"/>
+                <w:szCs w:val="28"/>
+                <w:cs/>
+                <w:lang w:bidi="ta-IN"/>
+              </w:rPr>
+              <w:t>தூ</w:t>
+            </w:r>
+            <w:r>
+              <w:rPr>
+                <w:rFonts w:ascii="BRH Tamil Tab Extra" w:hAnsi="BRH Tamil Tab Extra" w:cs="Latha"/>
+                <w:b/>
+                <w:sz w:val="32"/>
+                <w:szCs w:val="28"/>
+                <w:lang w:bidi="ta-IN"/>
+              </w:rPr>
+              <w:t>…</w:t>
+            </w:r>
+            <w:r>
+              <w:rPr>
+                <w:rFonts w:ascii="Latha" w:hAnsi="Latha" w:cs="Latha"/>
+                <w:sz w:val="28"/>
+                <w:szCs w:val="28"/>
+                <w:cs/>
+                <w:lang w:bidi="ta-IN"/>
+              </w:rPr>
+              <w:t>ஷ்ணீங்</w:t>
+            </w:r>
+            <w:r>
+              <w:rPr>
+                <w:rFonts w:ascii="Latha" w:hAnsi="Latha" w:cs="Latha"/>
+                <w:sz w:val="28"/>
+                <w:szCs w:val="28"/>
+                <w:lang w:bidi="ta-IN"/>
+              </w:rPr>
+              <w:t xml:space="preserve"> </w:t>
+            </w:r>
+            <w:r>
+              <w:rPr>
+                <w:rFonts w:ascii="Latha" w:hAnsi="Latha" w:cs="Latha"/>
+                <w:sz w:val="28"/>
+                <w:szCs w:val="28"/>
+                <w:cs/>
+                <w:lang w:bidi="ta-IN"/>
+              </w:rPr>
+              <w:t>க்</w:t>
+            </w:r>
+            <w:r>
+              <w:rPr>
+                <w:rFonts w:ascii="Latha" w:hAnsi="Latha" w:cs="Latha"/>
+                <w:b/>
+                <w:bCs/>
+                <w:position w:val="-12"/>
+                <w:sz w:val="28"/>
+                <w:szCs w:val="28"/>
+                <w:cs/>
+                <w:lang w:bidi="ta-IN"/>
+              </w:rPr>
+              <w:t>3</w:t>
+            </w:r>
+            <w:r>
+              <w:rPr>
+                <w:rFonts w:ascii="Latha" w:hAnsi="Latha" w:cs="Latha"/>
+                <w:sz w:val="28"/>
+                <w:szCs w:val="28"/>
+                <w:cs/>
+                <w:lang w:bidi="ta-IN"/>
+              </w:rPr>
+              <w:t>ரஹான்</w:t>
+            </w:r>
+            <w:r>
+              <w:rPr>
+                <w:rFonts w:ascii="BRH Tamil Tab Extra" w:hAnsi="BRH Tamil Tab Extra" w:cs="Latha"/>
+                <w:b/>
+                <w:sz w:val="36"/>
+                <w:szCs w:val="28"/>
+                <w:lang w:bidi="ta-IN"/>
+              </w:rPr>
+              <w:t>†</w:t>
+            </w:r>
+            <w:r>
+              <w:rPr>
+                <w:rFonts w:ascii="Latha" w:hAnsi="Latha" w:cs="Latha"/>
+                <w:sz w:val="28"/>
+                <w:szCs w:val="28"/>
+                <w:lang w:bidi="ta-IN"/>
+              </w:rPr>
+              <w:t xml:space="preserve"> | </w:t>
+            </w:r>
+            <w:r>
+              <w:rPr>
+                <w:rFonts w:ascii="Latha" w:hAnsi="Latha" w:cs="Latha"/>
+                <w:sz w:val="28"/>
+                <w:szCs w:val="28"/>
+                <w:highlight w:val="yellow"/>
+                <w:cs/>
+                <w:lang w:bidi="ta-IN"/>
+              </w:rPr>
+              <w:t>க்</w:t>
+            </w:r>
+            <w:r>
+              <w:rPr>
+                <w:rFonts w:ascii="Latha" w:hAnsi="Latha" w:cs="Latha"/>
+                <w:b/>
+                <w:bCs/>
+                <w:position w:val="-12"/>
+                <w:sz w:val="28"/>
+                <w:szCs w:val="28"/>
+                <w:highlight w:val="yellow"/>
+                <w:cs/>
+                <w:lang w:bidi="ta-IN"/>
+              </w:rPr>
+              <w:t>3</w:t>
+            </w:r>
+            <w:r>
+              <w:rPr>
+                <w:rFonts w:ascii="Latha" w:hAnsi="Latha" w:cs="Latha"/>
+                <w:b/>
+                <w:bCs/>
+                <w:i/>
+                <w:iCs/>
+                <w:sz w:val="28"/>
+                <w:szCs w:val="28"/>
+                <w:highlight w:val="yellow"/>
+                <w:cs/>
+                <w:lang w:bidi="ta-IN"/>
+              </w:rPr>
+              <w:t>ரு</w:t>
+            </w:r>
+            <w:r>
+              <w:rPr>
+                <w:rFonts w:ascii="Latha" w:hAnsi="Latha" w:cs="Latha"/>
+                <w:sz w:val="28"/>
+                <w:szCs w:val="28"/>
+                <w:cs/>
+                <w:lang w:bidi="ta-IN"/>
+              </w:rPr>
+              <w:t>ஹா</w:t>
+            </w:r>
+            <w:r>
+              <w:rPr>
+                <w:rFonts w:ascii="BRH Tamil Tab Extra" w:hAnsi="BRH Tamil Tab Extra" w:cs="Latha"/>
+                <w:b/>
+                <w:sz w:val="36"/>
+                <w:szCs w:val="28"/>
+                <w:lang w:bidi="ta-IN"/>
+              </w:rPr>
+              <w:t>†</w:t>
+            </w:r>
+            <w:r>
+              <w:rPr>
+                <w:rFonts w:ascii="Latha" w:hAnsi="Latha" w:cs="Latha"/>
+                <w:sz w:val="28"/>
+                <w:szCs w:val="28"/>
+                <w:cs/>
+                <w:lang w:bidi="ta-IN"/>
+              </w:rPr>
+              <w:t>னக்</w:t>
+            </w:r>
+            <w:r>
+              <w:rPr>
+                <w:rFonts w:ascii="Latha" w:hAnsi="Latha" w:cs="Latha"/>
+                <w:b/>
+                <w:bCs/>
+                <w:position w:val="-12"/>
+                <w:sz w:val="28"/>
+                <w:szCs w:val="28"/>
+                <w:cs/>
+                <w:lang w:bidi="ta-IN"/>
+              </w:rPr>
+              <w:t>3</w:t>
+            </w:r>
+            <w:r>
+              <w:rPr>
+                <w:rFonts w:ascii="Latha" w:hAnsi="Latha" w:cs="Latha"/>
+                <w:b/>
+                <w:bCs/>
+                <w:i/>
+                <w:iCs/>
+                <w:sz w:val="28"/>
+                <w:szCs w:val="28"/>
+                <w:cs/>
+                <w:lang w:bidi="ta-IN"/>
+              </w:rPr>
+              <w:t>ரு</w:t>
+            </w:r>
+            <w:r>
+              <w:rPr>
+                <w:rFonts w:ascii="Latha" w:hAnsi="Latha" w:cs="Latha"/>
+                <w:sz w:val="28"/>
+                <w:szCs w:val="28"/>
+                <w:cs/>
+                <w:lang w:bidi="ta-IN"/>
+              </w:rPr>
+              <w:t>ஹ்ணத</w:t>
+            </w:r>
+            <w:r>
+              <w:rPr>
+                <w:rFonts w:ascii="Latha" w:hAnsi="Latha" w:cs="Latha"/>
+                <w:sz w:val="28"/>
+                <w:szCs w:val="28"/>
+                <w:lang w:bidi="ta-IN"/>
+              </w:rPr>
+              <w:t xml:space="preserve"> |</w:t>
+            </w:r>
+          </w:p>
+        </w:tc>
+        <w:tc>
+          <w:tcPr>
+            <w:tcW w:w="5811" w:type="dxa"/>
+          </w:tcPr>
+          <w:p>
+            <w:pPr>
+              <w:spacing w:before="0" w:line="240" w:lineRule="auto"/>
+              <w:rPr>
+                <w:rFonts w:ascii="Latha" w:hAnsi="Latha" w:cs="Latha"/>
+                <w:sz w:val="28"/>
+                <w:szCs w:val="28"/>
+                <w:cs/>
+                <w:lang w:bidi="ta-IN"/>
+              </w:rPr>
+            </w:pPr>
+            <w:r>
+              <w:rPr>
+                <w:rFonts w:ascii="Latha" w:hAnsi="Latha" w:cs="Latha"/>
+                <w:sz w:val="28"/>
+                <w:szCs w:val="28"/>
+                <w:cs/>
+                <w:lang w:bidi="ta-IN"/>
+              </w:rPr>
+              <w:t>தூ</w:t>
+            </w:r>
+            <w:r>
+              <w:rPr>
+                <w:rFonts w:ascii="BRH Tamil Tab Extra" w:hAnsi="BRH Tamil Tab Extra" w:cs="Latha"/>
+                <w:b/>
+                <w:sz w:val="32"/>
+                <w:szCs w:val="28"/>
+                <w:lang w:bidi="ta-IN"/>
+              </w:rPr>
+              <w:t>…</w:t>
+            </w:r>
+            <w:r>
+              <w:rPr>
+                <w:rFonts w:ascii="Latha" w:hAnsi="Latha" w:cs="Latha"/>
+                <w:sz w:val="28"/>
+                <w:szCs w:val="28"/>
+                <w:cs/>
+                <w:lang w:bidi="ta-IN"/>
+              </w:rPr>
+              <w:t>ஷ்ணீங்</w:t>
+            </w:r>
+            <w:r>
+              <w:rPr>
+                <w:rFonts w:ascii="Latha" w:hAnsi="Latha" w:cs="Latha"/>
+                <w:sz w:val="28"/>
+                <w:szCs w:val="28"/>
+                <w:lang w:bidi="ta-IN"/>
+              </w:rPr>
+              <w:t xml:space="preserve"> </w:t>
+            </w:r>
+            <w:r>
+              <w:rPr>
+                <w:rFonts w:ascii="Latha" w:hAnsi="Latha" w:cs="Latha"/>
+                <w:sz w:val="28"/>
+                <w:szCs w:val="28"/>
+                <w:cs/>
+                <w:lang w:bidi="ta-IN"/>
+              </w:rPr>
+              <w:t>க்</w:t>
+            </w:r>
+            <w:r>
+              <w:rPr>
+                <w:rFonts w:ascii="Latha" w:hAnsi="Latha" w:cs="Latha"/>
+                <w:b/>
+                <w:bCs/>
+                <w:position w:val="-12"/>
+                <w:sz w:val="28"/>
+                <w:szCs w:val="28"/>
+                <w:cs/>
+                <w:lang w:bidi="ta-IN"/>
+              </w:rPr>
+              <w:t>3</w:t>
+            </w:r>
+            <w:r>
+              <w:rPr>
+                <w:rFonts w:ascii="Latha" w:hAnsi="Latha" w:cs="Latha"/>
+                <w:sz w:val="28"/>
+                <w:szCs w:val="28"/>
+                <w:cs/>
+                <w:lang w:bidi="ta-IN"/>
+              </w:rPr>
+              <w:t>ரஹான்</w:t>
+            </w:r>
+            <w:r>
+              <w:rPr>
+                <w:rFonts w:ascii="BRH Tamil Tab Extra" w:hAnsi="BRH Tamil Tab Extra" w:cs="Latha"/>
+                <w:b/>
+                <w:sz w:val="36"/>
+                <w:szCs w:val="28"/>
+                <w:lang w:bidi="ta-IN"/>
+              </w:rPr>
+              <w:t>†</w:t>
+            </w:r>
+            <w:r>
+              <w:rPr>
+                <w:rFonts w:ascii="Latha" w:hAnsi="Latha" w:cs="Latha"/>
+                <w:sz w:val="28"/>
+                <w:szCs w:val="28"/>
+                <w:lang w:bidi="ta-IN"/>
+              </w:rPr>
+              <w:t xml:space="preserve"> | </w:t>
+            </w:r>
+            <w:r>
+              <w:rPr>
+                <w:rFonts w:ascii="Latha" w:hAnsi="Latha" w:cs="Latha"/>
+                <w:sz w:val="28"/>
+                <w:szCs w:val="28"/>
+                <w:highlight w:val="green"/>
+                <w:cs/>
+                <w:lang w:bidi="ta-IN"/>
+              </w:rPr>
+              <w:t>க்</w:t>
+            </w:r>
+            <w:r>
+              <w:rPr>
+                <w:rFonts w:ascii="Latha" w:hAnsi="Latha" w:cs="Latha"/>
+                <w:b/>
+                <w:bCs/>
+                <w:position w:val="-12"/>
+                <w:sz w:val="28"/>
+                <w:szCs w:val="28"/>
+                <w:highlight w:val="green"/>
+                <w:cs/>
+                <w:lang w:bidi="ta-IN"/>
+              </w:rPr>
+              <w:t>3</w:t>
+            </w:r>
+            <w:r>
+              <w:rPr>
+                <w:rFonts w:ascii="Latha" w:hAnsi="Latha" w:cs="Latha"/>
+                <w:sz w:val="28"/>
+                <w:szCs w:val="28"/>
+                <w:highlight w:val="green"/>
+                <w:cs/>
+                <w:lang w:bidi="ta-IN"/>
+              </w:rPr>
+              <w:t>ர</w:t>
+            </w:r>
+            <w:r>
+              <w:rPr>
+                <w:rFonts w:ascii="Latha" w:hAnsi="Latha" w:cs="Latha"/>
+                <w:sz w:val="28"/>
+                <w:szCs w:val="28"/>
+                <w:cs/>
+                <w:lang w:bidi="ta-IN"/>
+              </w:rPr>
+              <w:t>ஹா</w:t>
+            </w:r>
+            <w:r>
+              <w:rPr>
+                <w:rFonts w:ascii="BRH Tamil Tab Extra" w:hAnsi="BRH Tamil Tab Extra" w:cs="Latha"/>
+                <w:b/>
+                <w:sz w:val="36"/>
+                <w:szCs w:val="28"/>
+                <w:lang w:bidi="ta-IN"/>
+              </w:rPr>
+              <w:t>†</w:t>
+            </w:r>
+            <w:r>
+              <w:rPr>
+                <w:rFonts w:ascii="Latha" w:hAnsi="Latha" w:cs="Latha"/>
+                <w:sz w:val="28"/>
+                <w:szCs w:val="28"/>
+                <w:cs/>
+                <w:lang w:bidi="ta-IN"/>
+              </w:rPr>
+              <w:t>னக்</w:t>
+            </w:r>
+            <w:r>
+              <w:rPr>
+                <w:rFonts w:ascii="Latha" w:hAnsi="Latha" w:cs="Latha"/>
+                <w:b/>
+                <w:bCs/>
+                <w:position w:val="-12"/>
+                <w:sz w:val="28"/>
+                <w:szCs w:val="28"/>
+                <w:cs/>
+                <w:lang w:bidi="ta-IN"/>
+              </w:rPr>
+              <w:t>3</w:t>
+            </w:r>
+            <w:r>
+              <w:rPr>
+                <w:rFonts w:ascii="Latha" w:hAnsi="Latha" w:cs="Latha"/>
+                <w:b/>
+                <w:bCs/>
+                <w:i/>
+                <w:iCs/>
+                <w:sz w:val="28"/>
+                <w:szCs w:val="28"/>
+                <w:cs/>
+                <w:lang w:bidi="ta-IN"/>
+              </w:rPr>
+              <w:t>ரு</w:t>
+            </w:r>
+            <w:r>
+              <w:rPr>
+                <w:rFonts w:ascii="Latha" w:hAnsi="Latha" w:cs="Latha"/>
+                <w:sz w:val="28"/>
+                <w:szCs w:val="28"/>
+                <w:cs/>
+                <w:lang w:bidi="ta-IN"/>
+              </w:rPr>
+              <w:t>ஹ்ணத</w:t>
+            </w:r>
+            <w:r>
+              <w:rPr>
+                <w:rFonts w:ascii="Latha" w:hAnsi="Latha" w:cs="Latha"/>
+                <w:sz w:val="28"/>
+                <w:szCs w:val="28"/>
+                <w:lang w:bidi="ta-IN"/>
               </w:rPr>
               <w:t xml:space="preserve"> |</w:t>
             </w:r>
@@ -1583,10 +4095,7 @@
           <w:lang w:val="it-IT"/>
         </w:rPr>
       </w:pPr>
-    </w:p>
-    <w:p>
-      <w:pPr>
-        <w:jc w:val="center"/>
+      <w:r>
         <w:rPr>
           <w:b/>
           <w:bCs/>
@@ -1595,33 +4104,8 @@
           <w:u w:val="single"/>
           <w:lang w:val="it-IT"/>
         </w:rPr>
-      </w:pPr>
-    </w:p>
-    <w:p>
-      <w:pPr>
-        <w:jc w:val="center"/>
-        <w:rPr>
-          <w:b/>
-          <w:bCs/>
-          <w:sz w:val="32"/>
-          <w:szCs w:val="32"/>
-          <w:u w:val="single"/>
-          <w:lang w:val="it-IT"/>
-        </w:rPr>
-      </w:pPr>
-    </w:p>
-    <w:p>
-      <w:pPr>
-        <w:jc w:val="center"/>
-        <w:rPr>
-          <w:b/>
-          <w:bCs/>
-          <w:sz w:val="32"/>
-          <w:szCs w:val="32"/>
-          <w:u w:val="single"/>
-          <w:lang w:val="it-IT"/>
-        </w:rPr>
-      </w:pPr>
+        <w:t>============================================</w:t>
+      </w:r>
     </w:p>
     <w:p>
       <w:pPr>
@@ -1906,7 +4390,6 @@
                 <w:sz w:val="28"/>
                 <w:szCs w:val="32"/>
               </w:rPr>
-              <w:lastRenderedPageBreak/>
               <w:t>T.S.6.4.1</w:t>
             </w:r>
             <w:r>
@@ -2626,6 +5109,9 @@
     </w:tbl>
     <w:p>
       <w:pPr>
+        <w:pBdr>
+          <w:bottom w:val="double" w:sz="6" w:space="1" w:color="auto"/>
+        </w:pBdr>
         <w:jc w:val="center"/>
         <w:rPr>
           <w:b/>
@@ -2635,7 +5121,10 @@
           <w:u w:val="single"/>
         </w:rPr>
       </w:pPr>
-      <w:r>
+    </w:p>
+    <w:p>
+      <w:pPr>
+        <w:jc w:val="center"/>
         <w:rPr>
           <w:b/>
           <w:bCs/>
@@ -2643,8 +5132,31 @@
           <w:szCs w:val="32"/>
           <w:u w:val="single"/>
         </w:rPr>
-        <w:t>============</w:t>
-      </w:r>
+      </w:pPr>
+    </w:p>
+    <w:p>
+      <w:pPr>
+        <w:jc w:val="center"/>
+        <w:rPr>
+          <w:b/>
+          <w:bCs/>
+          <w:sz w:val="32"/>
+          <w:szCs w:val="32"/>
+          <w:u w:val="single"/>
+        </w:rPr>
+      </w:pPr>
+    </w:p>
+    <w:p>
+      <w:pPr>
+        <w:jc w:val="center"/>
+        <w:rPr>
+          <w:b/>
+          <w:bCs/>
+          <w:sz w:val="32"/>
+          <w:szCs w:val="32"/>
+          <w:u w:val="single"/>
+        </w:rPr>
+      </w:pPr>
     </w:p>
     <w:p>
       <w:pPr>
@@ -2665,6 +5177,7 @@
           <w:szCs w:val="32"/>
           <w:u w:val="single"/>
         </w:rPr>
+        <w:lastRenderedPageBreak/>
         <w:t xml:space="preserve">TS </w:t>
       </w:r>
       <w:r>
@@ -5369,7 +7882,6 @@
                 <w:sz w:val="28"/>
                 <w:szCs w:val="32"/>
               </w:rPr>
-              <w:lastRenderedPageBreak/>
               <w:t>T.S.6.4.2.4 – Kramam</w:t>
             </w:r>
           </w:p>
@@ -5863,6 +8375,7 @@
                 <w:sz w:val="28"/>
                 <w:szCs w:val="32"/>
               </w:rPr>
+              <w:lastRenderedPageBreak/>
               <w:t>T.S.6.4.2.6 – Kramam</w:t>
             </w:r>
           </w:p>
@@ -8601,7 +11114,6 @@
                 <w:sz w:val="28"/>
                 <w:szCs w:val="32"/>
               </w:rPr>
-              <w:lastRenderedPageBreak/>
               <w:t>T.S.6.4.7.2 – Kramam</w:t>
             </w:r>
           </w:p>
@@ -9627,6 +12139,7 @@
                 <w:sz w:val="28"/>
                 <w:szCs w:val="32"/>
               </w:rPr>
+              <w:lastRenderedPageBreak/>
               <w:t>T.S.6.4.8.3 – Kramam</w:t>
             </w:r>
           </w:p>
@@ -12809,7 +15322,6 @@
                 <w:sz w:val="28"/>
                 <w:szCs w:val="32"/>
               </w:rPr>
-              <w:lastRenderedPageBreak/>
               <w:t>T.S.6.4.11.1 – Kramam</w:t>
             </w:r>
           </w:p>
@@ -13267,7 +15779,16 @@
           <w:bCs/>
           <w:sz w:val="32"/>
         </w:rPr>
-        <w:t>replaced with</w:t>
+        <w:t xml:space="preserve">replaced </w:t>
+      </w:r>
+      <w:proofErr w:type="gramStart"/>
+      <w:r>
+        <w:rPr>
+          <w:b/>
+          <w:bCs/>
+          <w:sz w:val="32"/>
+        </w:rPr>
+        <w:t>with</w:t>
       </w:r>
       <w:r>
         <w:rPr>
@@ -13289,6 +15810,7 @@
         </w:rPr>
         <w:t>"</w:t>
       </w:r>
+      <w:proofErr w:type="gramEnd"/>
       <w:r>
         <w:rPr>
           <w:rFonts w:ascii="Latha" w:hAnsi="Latha" w:cs="Latha"/>
@@ -13353,6 +15875,7 @@
           <w:szCs w:val="32"/>
           <w:u w:val="single"/>
         </w:rPr>
+        <w:lastRenderedPageBreak/>
         <w:t xml:space="preserve">TS </w:t>
       </w:r>
       <w:r>
@@ -13807,14 +16330,35 @@
         <w:bCs/>
       </w:rPr>
       <w:tab/>
-      <w:t xml:space="preserve">              v</w:t>
+      <w:t xml:space="preserve">             </w:t>
     </w:r>
     <w:r>
       <w:rPr>
         <w:b/>
         <w:bCs/>
       </w:rPr>
-      <w:t>edavms@gmail.com</w:t>
+      <w:t>www.</w:t>
+    </w:r>
+    <w:r>
+      <w:rPr>
+        <w:b/>
+        <w:bCs/>
+      </w:rPr>
+      <w:t>v</w:t>
+    </w:r>
+    <w:r>
+      <w:rPr>
+        <w:b/>
+        <w:bCs/>
+      </w:rPr>
+      <w:t>edavms</w:t>
+    </w:r>
+    <w:r>
+      <w:rPr>
+        <w:b/>
+        <w:bCs/>
+      </w:rPr>
+      <w:t>.in</w:t>
     </w:r>
     <w:r>
       <w:rPr>
@@ -13838,7 +16382,13 @@
       <w:tab/>
     </w:r>
     <w:r>
-      <w:t xml:space="preserve">           </w:t>
+      <w:t xml:space="preserve">   </w:t>
+    </w:r>
+    <w:r>
+      <w:t xml:space="preserve">            </w:t>
+    </w:r>
+    <w:r>
+      <w:t xml:space="preserve">        </w:t>
     </w:r>
     <w:r>
       <w:tab/>
@@ -14033,7 +16583,13 @@
       <w:tab/>
     </w:r>
     <w:r>
-      <w:t xml:space="preserve">            </w:t>
+      <w:t xml:space="preserve"> </w:t>
+    </w:r>
+    <w:r>
+      <w:t xml:space="preserve">           </w:t>
+    </w:r>
+    <w:r>
+      <w:t xml:space="preserve">         </w:t>
     </w:r>
     <w:r>
       <w:tab/>
@@ -14587,7 +17143,7 @@
   <w:style w:type="paragraph" w:default="1" w:styleId="Normal">
     <w:name w:val="Normal"/>
     <w:qFormat/>
-    <w:rsid w:val="00076C05"/>
+    <w:rsid w:val="004B66E6"/>
     <w:pPr>
       <w:spacing w:before="120" w:line="276" w:lineRule="auto"/>
     </w:pPr>

</xml_diff>